<commit_message>
Adicionando Plano inicial de segurança e LGPD na documentaçao
</commit_message>
<xml_diff>
--- a/Documentaçao/Oceanun.docx
+++ b/Documentaçao/Oceanun.docx
@@ -279,6 +279,12 @@
     </w:p>
     <w:sdt>
       <w:sdtPr>
+        <w:rPr>
+          <w:rFonts w:ascii="Times New Roman" w:eastAsia="Arial" w:hAnsi="Times New Roman" w:cs="Arial"/>
+          <w:color w:val="auto"/>
+          <w:sz w:val="24"/>
+          <w:szCs w:val="22"/>
+        </w:rPr>
         <w:id w:val="-1508357883"/>
         <w:docPartObj>
           <w:docPartGallery w:val="Table of Contents"/>
@@ -287,12 +293,8 @@
       </w:sdtPr>
       <w:sdtEndPr>
         <w:rPr>
-          <w:rFonts w:ascii="Times New Roman" w:eastAsia="Arial" w:hAnsi="Times New Roman" w:cs="Arial"/>
           <w:b/>
           <w:bCs/>
-          <w:color w:val="auto"/>
-          <w:sz w:val="24"/>
-          <w:szCs w:val="22"/>
         </w:rPr>
       </w:sdtEndPr>
       <w:sdtContent>
@@ -321,6 +323,7 @@
               <w:noProof/>
               <w:kern w:val="2"/>
               <w:szCs w:val="24"/>
+              <w14:ligatures w14:val="standardContextual"/>
             </w:rPr>
           </w:pPr>
           <w:r>
@@ -332,7 +335,7 @@
           <w:r>
             <w:fldChar w:fldCharType="separate"/>
           </w:r>
-          <w:hyperlink w:anchor="_Toc242971808" w:history="1">
+          <w:hyperlink w:anchor="_Toc242972990" w:history="1">
             <w:r>
               <w:rPr>
                 <w:rStyle w:val="Hyperlink"/>
@@ -359,7 +362,7 @@
                 <w:noProof/>
                 <w:webHidden/>
               </w:rPr>
-              <w:instrText xml:space="preserve"> PAGEREF _Toc242971808 \h </w:instrText>
+              <w:instrText xml:space="preserve"> PAGEREF _Toc242972990 \h </w:instrText>
             </w:r>
             <w:r>
               <w:rPr>
@@ -379,7 +382,7 @@
                 <w:noProof/>
                 <w:webHidden/>
               </w:rPr>
-              <w:t>3</w:t>
+              <w:t>4</w:t>
             </w:r>
             <w:r>
               <w:rPr>
@@ -401,9 +404,10 @@
               <w:noProof/>
               <w:kern w:val="2"/>
               <w:szCs w:val="24"/>
+              <w14:ligatures w14:val="standardContextual"/>
             </w:rPr>
           </w:pPr>
-          <w:hyperlink w:anchor="_Toc242971809" w:history="1">
+          <w:hyperlink w:anchor="_Toc242972991" w:history="1">
             <w:r>
               <w:rPr>
                 <w:rStyle w:val="Hyperlink"/>
@@ -430,7 +434,7 @@
                 <w:noProof/>
                 <w:webHidden/>
               </w:rPr>
-              <w:instrText xml:space="preserve"> PAGEREF _Toc242971809 \h </w:instrText>
+              <w:instrText xml:space="preserve"> PAGEREF _Toc242972991 \h </w:instrText>
             </w:r>
             <w:r>
               <w:rPr>
@@ -450,7 +454,7 @@
                 <w:noProof/>
                 <w:webHidden/>
               </w:rPr>
-              <w:t>4</w:t>
+              <w:t>5</w:t>
             </w:r>
             <w:r>
               <w:rPr>
@@ -472,9 +476,10 @@
               <w:noProof/>
               <w:kern w:val="2"/>
               <w:szCs w:val="24"/>
+              <w14:ligatures w14:val="standardContextual"/>
             </w:rPr>
           </w:pPr>
-          <w:hyperlink w:anchor="_Toc242971810" w:history="1">
+          <w:hyperlink w:anchor="_Toc242972992" w:history="1">
             <w:r>
               <w:rPr>
                 <w:rStyle w:val="Hyperlink"/>
@@ -501,7 +506,7 @@
                 <w:noProof/>
                 <w:webHidden/>
               </w:rPr>
-              <w:instrText xml:space="preserve"> PAGEREF _Toc242971810 \h </w:instrText>
+              <w:instrText xml:space="preserve"> PAGEREF _Toc242972992 \h </w:instrText>
             </w:r>
             <w:r>
               <w:rPr>
@@ -521,7 +526,7 @@
                 <w:noProof/>
                 <w:webHidden/>
               </w:rPr>
-              <w:t>4</w:t>
+              <w:t>5</w:t>
             </w:r>
             <w:r>
               <w:rPr>
@@ -543,9 +548,10 @@
               <w:noProof/>
               <w:kern w:val="2"/>
               <w:szCs w:val="24"/>
+              <w14:ligatures w14:val="standardContextual"/>
             </w:rPr>
           </w:pPr>
-          <w:hyperlink w:anchor="_Toc242971811" w:history="1">
+          <w:hyperlink w:anchor="_Toc242972993" w:history="1">
             <w:r>
               <w:rPr>
                 <w:rStyle w:val="Hyperlink"/>
@@ -572,7 +578,7 @@
                 <w:noProof/>
                 <w:webHidden/>
               </w:rPr>
-              <w:instrText xml:space="preserve"> PAGEREF _Toc242971811 \h </w:instrText>
+              <w:instrText xml:space="preserve"> PAGEREF _Toc242972993 \h </w:instrText>
             </w:r>
             <w:r>
               <w:rPr>
@@ -592,7 +598,7 @@
                 <w:noProof/>
                 <w:webHidden/>
               </w:rPr>
-              <w:t>5</w:t>
+              <w:t>6</w:t>
             </w:r>
             <w:r>
               <w:rPr>
@@ -614,9 +620,10 @@
               <w:noProof/>
               <w:kern w:val="2"/>
               <w:szCs w:val="24"/>
+              <w14:ligatures w14:val="standardContextual"/>
             </w:rPr>
           </w:pPr>
-          <w:hyperlink w:anchor="_Toc242971812" w:history="1">
+          <w:hyperlink w:anchor="_Toc242972994" w:history="1">
             <w:r>
               <w:rPr>
                 <w:rStyle w:val="Hyperlink"/>
@@ -643,7 +650,7 @@
                 <w:noProof/>
                 <w:webHidden/>
               </w:rPr>
-              <w:instrText xml:space="preserve"> PAGEREF _Toc242971812 \h </w:instrText>
+              <w:instrText xml:space="preserve"> PAGEREF _Toc242972994 \h </w:instrText>
             </w:r>
             <w:r>
               <w:rPr>
@@ -663,7 +670,7 @@
                 <w:noProof/>
                 <w:webHidden/>
               </w:rPr>
-              <w:t>5</w:t>
+              <w:t>6</w:t>
             </w:r>
             <w:r>
               <w:rPr>
@@ -685,9 +692,10 @@
               <w:noProof/>
               <w:kern w:val="2"/>
               <w:szCs w:val="24"/>
+              <w14:ligatures w14:val="standardContextual"/>
             </w:rPr>
           </w:pPr>
-          <w:hyperlink w:anchor="_Toc242971813" w:history="1">
+          <w:hyperlink w:anchor="_Toc242972995" w:history="1">
             <w:r>
               <w:rPr>
                 <w:rStyle w:val="Hyperlink"/>
@@ -714,7 +722,7 @@
                 <w:noProof/>
                 <w:webHidden/>
               </w:rPr>
-              <w:instrText xml:space="preserve"> PAGEREF _Toc242971813 \h </w:instrText>
+              <w:instrText xml:space="preserve"> PAGEREF _Toc242972995 \h </w:instrText>
             </w:r>
             <w:r>
               <w:rPr>
@@ -734,7 +742,7 @@
                 <w:noProof/>
                 <w:webHidden/>
               </w:rPr>
-              <w:t>5</w:t>
+              <w:t>6</w:t>
             </w:r>
             <w:r>
               <w:rPr>
@@ -756,9 +764,10 @@
               <w:noProof/>
               <w:kern w:val="2"/>
               <w:szCs w:val="24"/>
+              <w14:ligatures w14:val="standardContextual"/>
             </w:rPr>
           </w:pPr>
-          <w:hyperlink w:anchor="_Toc242971814" w:history="1">
+          <w:hyperlink w:anchor="_Toc242972996" w:history="1">
             <w:r>
               <w:rPr>
                 <w:rStyle w:val="Hyperlink"/>
@@ -785,7 +794,7 @@
                 <w:noProof/>
                 <w:webHidden/>
               </w:rPr>
-              <w:instrText xml:space="preserve"> PAGEREF _Toc242971814 \h </w:instrText>
+              <w:instrText xml:space="preserve"> PAGEREF _Toc242972996 \h </w:instrText>
             </w:r>
             <w:r>
               <w:rPr>
@@ -805,7 +814,7 @@
                 <w:noProof/>
                 <w:webHidden/>
               </w:rPr>
-              <w:t>9</w:t>
+              <w:t>10</w:t>
             </w:r>
             <w:r>
               <w:rPr>
@@ -827,9 +836,10 @@
               <w:noProof/>
               <w:kern w:val="2"/>
               <w:szCs w:val="24"/>
+              <w14:ligatures w14:val="standardContextual"/>
             </w:rPr>
           </w:pPr>
-          <w:hyperlink w:anchor="_Toc242971815" w:history="1">
+          <w:hyperlink w:anchor="_Toc242972997" w:history="1">
             <w:r>
               <w:rPr>
                 <w:rStyle w:val="Hyperlink"/>
@@ -856,7 +866,7 @@
                 <w:noProof/>
                 <w:webHidden/>
               </w:rPr>
-              <w:instrText xml:space="preserve"> PAGEREF _Toc242971815 \h </w:instrText>
+              <w:instrText xml:space="preserve"> PAGEREF _Toc242972997 \h </w:instrText>
             </w:r>
             <w:r>
               <w:rPr>
@@ -876,7 +886,7 @@
                 <w:noProof/>
                 <w:webHidden/>
               </w:rPr>
-              <w:t>10</w:t>
+              <w:t>11</w:t>
             </w:r>
             <w:r>
               <w:rPr>
@@ -898,9 +908,10 @@
               <w:noProof/>
               <w:kern w:val="2"/>
               <w:szCs w:val="24"/>
+              <w14:ligatures w14:val="standardContextual"/>
             </w:rPr>
           </w:pPr>
-          <w:hyperlink w:anchor="_Toc242971816" w:history="1">
+          <w:hyperlink w:anchor="_Toc242972998" w:history="1">
             <w:r>
               <w:rPr>
                 <w:rStyle w:val="Hyperlink"/>
@@ -927,7 +938,7 @@
                 <w:noProof/>
                 <w:webHidden/>
               </w:rPr>
-              <w:instrText xml:space="preserve"> PAGEREF _Toc242971816 \h </w:instrText>
+              <w:instrText xml:space="preserve"> PAGEREF _Toc242972998 \h </w:instrText>
             </w:r>
             <w:r>
               <w:rPr>
@@ -947,7 +958,7 @@
                 <w:noProof/>
                 <w:webHidden/>
               </w:rPr>
-              <w:t>11</w:t>
+              <w:t>12</w:t>
             </w:r>
             <w:r>
               <w:rPr>
@@ -969,9 +980,10 @@
               <w:noProof/>
               <w:kern w:val="2"/>
               <w:szCs w:val="24"/>
+              <w14:ligatures w14:val="standardContextual"/>
             </w:rPr>
           </w:pPr>
-          <w:hyperlink w:anchor="_Toc242971817" w:history="1">
+          <w:hyperlink w:anchor="_Toc242972999" w:history="1">
             <w:r>
               <w:rPr>
                 <w:rStyle w:val="Hyperlink"/>
@@ -998,7 +1010,7 @@
                 <w:noProof/>
                 <w:webHidden/>
               </w:rPr>
-              <w:instrText xml:space="preserve"> PAGEREF _Toc242971817 \h </w:instrText>
+              <w:instrText xml:space="preserve"> PAGEREF _Toc242972999 \h </w:instrText>
             </w:r>
             <w:r>
               <w:rPr>
@@ -1018,7 +1030,7 @@
                 <w:noProof/>
                 <w:webHidden/>
               </w:rPr>
-              <w:t>20</w:t>
+              <w:t>21</w:t>
             </w:r>
             <w:r>
               <w:rPr>
@@ -1040,9 +1052,10 @@
               <w:noProof/>
               <w:kern w:val="2"/>
               <w:szCs w:val="24"/>
+              <w14:ligatures w14:val="standardContextual"/>
             </w:rPr>
           </w:pPr>
-          <w:hyperlink w:anchor="_Toc242971818" w:history="1">
+          <w:hyperlink w:anchor="_Toc242973000" w:history="1">
             <w:r>
               <w:rPr>
                 <w:rStyle w:val="Hyperlink"/>
@@ -1069,7 +1082,7 @@
                 <w:noProof/>
                 <w:webHidden/>
               </w:rPr>
-              <w:instrText xml:space="preserve"> PAGEREF _Toc242971818 \h </w:instrText>
+              <w:instrText xml:space="preserve"> PAGEREF _Toc242973000 \h </w:instrText>
             </w:r>
             <w:r>
               <w:rPr>
@@ -1089,7 +1102,7 @@
                 <w:noProof/>
                 <w:webHidden/>
               </w:rPr>
-              <w:t>20</w:t>
+              <w:t>21</w:t>
             </w:r>
             <w:r>
               <w:rPr>
@@ -1111,9 +1124,10 @@
               <w:noProof/>
               <w:kern w:val="2"/>
               <w:szCs w:val="24"/>
+              <w14:ligatures w14:val="standardContextual"/>
             </w:rPr>
           </w:pPr>
-          <w:hyperlink w:anchor="_Toc242971819" w:history="1">
+          <w:hyperlink w:anchor="_Toc242973001" w:history="1">
             <w:r>
               <w:rPr>
                 <w:rStyle w:val="Hyperlink"/>
@@ -1140,7 +1154,7 @@
                 <w:noProof/>
                 <w:webHidden/>
               </w:rPr>
-              <w:instrText xml:space="preserve"> PAGEREF _Toc242971819 \h </w:instrText>
+              <w:instrText xml:space="preserve"> PAGEREF _Toc242973001 \h </w:instrText>
             </w:r>
             <w:r>
               <w:rPr>
@@ -1160,7 +1174,7 @@
                 <w:noProof/>
                 <w:webHidden/>
               </w:rPr>
-              <w:t>23</w:t>
+              <w:t>24</w:t>
             </w:r>
             <w:r>
               <w:rPr>
@@ -1182,9 +1196,10 @@
               <w:noProof/>
               <w:kern w:val="2"/>
               <w:szCs w:val="24"/>
+              <w14:ligatures w14:val="standardContextual"/>
             </w:rPr>
           </w:pPr>
-          <w:hyperlink w:anchor="_Toc242971820" w:history="1">
+          <w:hyperlink w:anchor="_Toc242973002" w:history="1">
             <w:r>
               <w:rPr>
                 <w:rStyle w:val="Hyperlink"/>
@@ -1211,7 +1226,7 @@
                 <w:noProof/>
                 <w:webHidden/>
               </w:rPr>
-              <w:instrText xml:space="preserve"> PAGEREF _Toc242971820 \h </w:instrText>
+              <w:instrText xml:space="preserve"> PAGEREF _Toc242973002 \h </w:instrText>
             </w:r>
             <w:r>
               <w:rPr>
@@ -1231,7 +1246,7 @@
                 <w:noProof/>
                 <w:webHidden/>
               </w:rPr>
-              <w:t>24</w:t>
+              <w:t>25</w:t>
             </w:r>
             <w:r>
               <w:rPr>
@@ -1253,15 +1268,16 @@
               <w:noProof/>
               <w:kern w:val="2"/>
               <w:szCs w:val="24"/>
+              <w14:ligatures w14:val="standardContextual"/>
             </w:rPr>
           </w:pPr>
-          <w:hyperlink w:anchor="_Toc242971821" w:history="1">
+          <w:hyperlink w:anchor="_Toc242973003" w:history="1">
             <w:r>
               <w:rPr>
                 <w:rStyle w:val="Hyperlink"/>
                 <w:noProof/>
               </w:rPr>
-              <w:t>6.4 Plano inicial de segurança e LGPD</w:t>
+              <w:t>6.4 SGBD</w:t>
             </w:r>
             <w:r>
               <w:rPr>
@@ -1282,7 +1298,7 @@
                 <w:noProof/>
                 <w:webHidden/>
               </w:rPr>
-              <w:instrText xml:space="preserve"> PAGEREF _Toc242971821 \h </w:instrText>
+              <w:instrText xml:space="preserve"> PAGEREF _Toc242973003 \h </w:instrText>
             </w:r>
             <w:r>
               <w:rPr>
@@ -1302,7 +1318,7 @@
                 <w:noProof/>
                 <w:webHidden/>
               </w:rPr>
-              <w:t>29</w:t>
+              <w:t>30</w:t>
             </w:r>
             <w:r>
               <w:rPr>
@@ -1324,15 +1340,16 @@
               <w:noProof/>
               <w:kern w:val="2"/>
               <w:szCs w:val="24"/>
+              <w14:ligatures w14:val="standardContextual"/>
             </w:rPr>
           </w:pPr>
-          <w:hyperlink w:anchor="_Toc242971822" w:history="1">
+          <w:hyperlink w:anchor="_Toc242973004" w:history="1">
             <w:r>
               <w:rPr>
                 <w:rStyle w:val="Hyperlink"/>
                 <w:noProof/>
               </w:rPr>
-              <w:t>6.5 Plano de Testes</w:t>
+              <w:t>6.5 Plano inicial de segurança e LGPD</w:t>
             </w:r>
             <w:r>
               <w:rPr>
@@ -1353,7 +1370,7 @@
                 <w:noProof/>
                 <w:webHidden/>
               </w:rPr>
-              <w:instrText xml:space="preserve"> PAGEREF _Toc242971822 \h </w:instrText>
+              <w:instrText xml:space="preserve"> PAGEREF _Toc242973004 \h </w:instrText>
             </w:r>
             <w:r>
               <w:rPr>
@@ -1373,7 +1390,79 @@
                 <w:noProof/>
                 <w:webHidden/>
               </w:rPr>
-              <w:t>29</w:t>
+              <w:t>34</w:t>
+            </w:r>
+            <w:r>
+              <w:rPr>
+                <w:noProof/>
+                <w:webHidden/>
+              </w:rPr>
+              <w:fldChar w:fldCharType="end"/>
+            </w:r>
+          </w:hyperlink>
+        </w:p>
+        <w:p>
+          <w:pPr>
+            <w:pStyle w:val="Sumrio2"/>
+            <w:tabs>
+              <w:tab w:val="right" w:leader="dot" w:pos="9016"/>
+            </w:tabs>
+            <w:rPr>
+              <w:rFonts w:asciiTheme="minorHAnsi" w:eastAsiaTheme="minorEastAsia" w:hAnsiTheme="minorHAnsi" w:cstheme="minorBidi"/>
+              <w:noProof/>
+              <w:kern w:val="2"/>
+              <w:szCs w:val="24"/>
+              <w14:ligatures w14:val="standardContextual"/>
+            </w:rPr>
+          </w:pPr>
+          <w:hyperlink w:anchor="_Toc242973005" w:history="1">
+            <w:r>
+              <w:rPr>
+                <w:rStyle w:val="Hyperlink"/>
+                <w:noProof/>
+              </w:rPr>
+              <w:t>6.6 Plano de Testes</w:t>
+            </w:r>
+            <w:r>
+              <w:rPr>
+                <w:noProof/>
+                <w:webHidden/>
+              </w:rPr>
+              <w:tab/>
+            </w:r>
+            <w:r>
+              <w:rPr>
+                <w:noProof/>
+                <w:webHidden/>
+              </w:rPr>
+              <w:fldChar w:fldCharType="begin"/>
+            </w:r>
+            <w:r>
+              <w:rPr>
+                <w:noProof/>
+                <w:webHidden/>
+              </w:rPr>
+              <w:instrText xml:space="preserve"> PAGEREF _Toc242973005 \h </w:instrText>
+            </w:r>
+            <w:r>
+              <w:rPr>
+                <w:noProof/>
+                <w:webHidden/>
+              </w:rPr>
+            </w:r>
+            <w:r>
+              <w:rPr>
+                <w:noProof/>
+                <w:webHidden/>
+              </w:rPr>
+              <w:fldChar w:fldCharType="separate"/>
+            </w:r>
+            <w:r>
+              <w:rPr>
+                <w:noProof/>
+                <w:webHidden/>
+              </w:rPr>
+              <w:t>35</w:t>
             </w:r>
             <w:r>
               <w:rPr>
@@ -1395,9 +1484,10 @@
               <w:noProof/>
               <w:kern w:val="2"/>
               <w:szCs w:val="24"/>
+              <w14:ligatures w14:val="standardContextual"/>
             </w:rPr>
           </w:pPr>
-          <w:hyperlink w:anchor="_Toc242971823" w:history="1">
+          <w:hyperlink w:anchor="_Toc242973006" w:history="1">
             <w:r>
               <w:rPr>
                 <w:rStyle w:val="Hyperlink"/>
@@ -1424,7 +1514,7 @@
                 <w:noProof/>
                 <w:webHidden/>
               </w:rPr>
-              <w:instrText xml:space="preserve"> PAGEREF _Toc242971823 \h </w:instrText>
+              <w:instrText xml:space="preserve"> PAGEREF _Toc242973006 \h </w:instrText>
             </w:r>
             <w:r>
               <w:rPr>
@@ -1444,7 +1534,7 @@
                 <w:noProof/>
                 <w:webHidden/>
               </w:rPr>
-              <w:t>33</w:t>
+              <w:t>39</w:t>
             </w:r>
             <w:r>
               <w:rPr>
@@ -1466,9 +1556,10 @@
               <w:noProof/>
               <w:kern w:val="2"/>
               <w:szCs w:val="24"/>
+              <w14:ligatures w14:val="standardContextual"/>
             </w:rPr>
           </w:pPr>
-          <w:hyperlink w:anchor="_Toc242971824" w:history="1">
+          <w:hyperlink w:anchor="_Toc242973007" w:history="1">
             <w:r>
               <w:rPr>
                 <w:rStyle w:val="Hyperlink"/>
@@ -1495,7 +1586,7 @@
                 <w:noProof/>
                 <w:webHidden/>
               </w:rPr>
-              <w:instrText xml:space="preserve"> PAGEREF _Toc242971824 \h </w:instrText>
+              <w:instrText xml:space="preserve"> PAGEREF _Toc242973007 \h </w:instrText>
             </w:r>
             <w:r>
               <w:rPr>
@@ -1515,7 +1606,7 @@
                 <w:noProof/>
                 <w:webHidden/>
               </w:rPr>
-              <w:t>33</w:t>
+              <w:t>39</w:t>
             </w:r>
             <w:r>
               <w:rPr>
@@ -1537,9 +1628,10 @@
               <w:noProof/>
               <w:kern w:val="2"/>
               <w:szCs w:val="24"/>
+              <w14:ligatures w14:val="standardContextual"/>
             </w:rPr>
           </w:pPr>
-          <w:hyperlink w:anchor="_Toc242971825" w:history="1">
+          <w:hyperlink w:anchor="_Toc242973008" w:history="1">
             <w:r>
               <w:rPr>
                 <w:rStyle w:val="Hyperlink"/>
@@ -1566,7 +1658,7 @@
                 <w:noProof/>
                 <w:webHidden/>
               </w:rPr>
-              <w:instrText xml:space="preserve"> PAGEREF _Toc242971825 \h </w:instrText>
+              <w:instrText xml:space="preserve"> PAGEREF _Toc242973008 \h </w:instrText>
             </w:r>
             <w:r>
               <w:rPr>
@@ -1586,7 +1678,7 @@
                 <w:noProof/>
                 <w:webHidden/>
               </w:rPr>
-              <w:t>34</w:t>
+              <w:t>40</w:t>
             </w:r>
             <w:r>
               <w:rPr>
@@ -1608,9 +1700,10 @@
               <w:noProof/>
               <w:kern w:val="2"/>
               <w:szCs w:val="24"/>
+              <w14:ligatures w14:val="standardContextual"/>
             </w:rPr>
           </w:pPr>
-          <w:hyperlink w:anchor="_Toc242971826" w:history="1">
+          <w:hyperlink w:anchor="_Toc242973009" w:history="1">
             <w:r>
               <w:rPr>
                 <w:rStyle w:val="Hyperlink"/>
@@ -1637,7 +1730,7 @@
                 <w:noProof/>
                 <w:webHidden/>
               </w:rPr>
-              <w:instrText xml:space="preserve"> PAGEREF _Toc242971826 \h </w:instrText>
+              <w:instrText xml:space="preserve"> PAGEREF _Toc242973009 \h </w:instrText>
             </w:r>
             <w:r>
               <w:rPr>
@@ -1657,7 +1750,7 @@
                 <w:noProof/>
                 <w:webHidden/>
               </w:rPr>
-              <w:t>34</w:t>
+              <w:t>40</w:t>
             </w:r>
             <w:r>
               <w:rPr>
@@ -1679,9 +1772,10 @@
               <w:noProof/>
               <w:kern w:val="2"/>
               <w:szCs w:val="24"/>
+              <w14:ligatures w14:val="standardContextual"/>
             </w:rPr>
           </w:pPr>
-          <w:hyperlink w:anchor="_Toc242971827" w:history="1">
+          <w:hyperlink w:anchor="_Toc242973010" w:history="1">
             <w:r>
               <w:rPr>
                 <w:rStyle w:val="Hyperlink"/>
@@ -1708,7 +1802,7 @@
                 <w:noProof/>
                 <w:webHidden/>
               </w:rPr>
-              <w:instrText xml:space="preserve"> PAGEREF _Toc242971827 \h </w:instrText>
+              <w:instrText xml:space="preserve"> PAGEREF _Toc242973010 \h </w:instrText>
             </w:r>
             <w:r>
               <w:rPr>
@@ -1728,7 +1822,7 @@
                 <w:noProof/>
                 <w:webHidden/>
               </w:rPr>
-              <w:t>36</w:t>
+              <w:t>42</w:t>
             </w:r>
             <w:r>
               <w:rPr>
@@ -1750,9 +1844,10 @@
               <w:noProof/>
               <w:kern w:val="2"/>
               <w:szCs w:val="24"/>
+              <w14:ligatures w14:val="standardContextual"/>
             </w:rPr>
           </w:pPr>
-          <w:hyperlink w:anchor="_Toc242971828" w:history="1">
+          <w:hyperlink w:anchor="_Toc242973011" w:history="1">
             <w:r>
               <w:rPr>
                 <w:rStyle w:val="Hyperlink"/>
@@ -1781,7 +1876,7 @@
                 <w:noProof/>
                 <w:webHidden/>
               </w:rPr>
-              <w:instrText xml:space="preserve"> PAGEREF _Toc242971828 \h </w:instrText>
+              <w:instrText xml:space="preserve"> PAGEREF _Toc242973011 \h </w:instrText>
             </w:r>
             <w:r>
               <w:rPr>
@@ -1801,7 +1896,7 @@
                 <w:noProof/>
                 <w:webHidden/>
               </w:rPr>
-              <w:t>36</w:t>
+              <w:t>42</w:t>
             </w:r>
             <w:r>
               <w:rPr>
@@ -1823,9 +1918,10 @@
               <w:noProof/>
               <w:kern w:val="2"/>
               <w:szCs w:val="24"/>
+              <w14:ligatures w14:val="standardContextual"/>
             </w:rPr>
           </w:pPr>
-          <w:hyperlink w:anchor="_Toc242971829" w:history="1">
+          <w:hyperlink w:anchor="_Toc242973012" w:history="1">
             <w:r>
               <w:rPr>
                 <w:rStyle w:val="Hyperlink"/>
@@ -1854,7 +1950,7 @@
                 <w:noProof/>
                 <w:webHidden/>
               </w:rPr>
-              <w:instrText xml:space="preserve"> PAGEREF _Toc242971829 \h </w:instrText>
+              <w:instrText xml:space="preserve"> PAGEREF _Toc242973012 \h </w:instrText>
             </w:r>
             <w:r>
               <w:rPr>
@@ -1874,7 +1970,7 @@
                 <w:noProof/>
                 <w:webHidden/>
               </w:rPr>
-              <w:t>36</w:t>
+              <w:t>42</w:t>
             </w:r>
             <w:r>
               <w:rPr>
@@ -1896,9 +1992,10 @@
               <w:noProof/>
               <w:kern w:val="2"/>
               <w:szCs w:val="24"/>
+              <w14:ligatures w14:val="standardContextual"/>
             </w:rPr>
           </w:pPr>
-          <w:hyperlink w:anchor="_Toc242971830" w:history="1">
+          <w:hyperlink w:anchor="_Toc242973013" w:history="1">
             <w:r>
               <w:rPr>
                 <w:rStyle w:val="Hyperlink"/>
@@ -1927,7 +2024,7 @@
                 <w:noProof/>
                 <w:webHidden/>
               </w:rPr>
-              <w:instrText xml:space="preserve"> PAGEREF _Toc242971830 \h </w:instrText>
+              <w:instrText xml:space="preserve"> PAGEREF _Toc242973013 \h </w:instrText>
             </w:r>
             <w:r>
               <w:rPr>
@@ -1947,7 +2044,7 @@
                 <w:noProof/>
                 <w:webHidden/>
               </w:rPr>
-              <w:t>37</w:t>
+              <w:t>43</w:t>
             </w:r>
             <w:r>
               <w:rPr>
@@ -1969,9 +2066,10 @@
               <w:noProof/>
               <w:kern w:val="2"/>
               <w:szCs w:val="24"/>
+              <w14:ligatures w14:val="standardContextual"/>
             </w:rPr>
           </w:pPr>
-          <w:hyperlink w:anchor="_Toc242971831" w:history="1">
+          <w:hyperlink w:anchor="_Toc242973014" w:history="1">
             <w:r>
               <w:rPr>
                 <w:rStyle w:val="Hyperlink"/>
@@ -1998,7 +2096,7 @@
                 <w:noProof/>
                 <w:webHidden/>
               </w:rPr>
-              <w:instrText xml:space="preserve"> PAGEREF _Toc242971831 \h </w:instrText>
+              <w:instrText xml:space="preserve"> PAGEREF _Toc242973014 \h </w:instrText>
             </w:r>
             <w:r>
               <w:rPr>
@@ -2018,7 +2116,7 @@
                 <w:noProof/>
                 <w:webHidden/>
               </w:rPr>
-              <w:t>37</w:t>
+              <w:t>43</w:t>
             </w:r>
             <w:r>
               <w:rPr>
@@ -2040,9 +2138,10 @@
               <w:noProof/>
               <w:kern w:val="2"/>
               <w:szCs w:val="24"/>
+              <w14:ligatures w14:val="standardContextual"/>
             </w:rPr>
           </w:pPr>
-          <w:hyperlink w:anchor="_Toc242971832" w:history="1">
+          <w:hyperlink w:anchor="_Toc242973015" w:history="1">
             <w:r>
               <w:rPr>
                 <w:rStyle w:val="Hyperlink"/>
@@ -2069,7 +2168,7 @@
                 <w:noProof/>
                 <w:webHidden/>
               </w:rPr>
-              <w:instrText xml:space="preserve"> PAGEREF _Toc242971832 \h </w:instrText>
+              <w:instrText xml:space="preserve"> PAGEREF _Toc242973015 \h </w:instrText>
             </w:r>
             <w:r>
               <w:rPr>
@@ -2089,7 +2188,7 @@
                 <w:noProof/>
                 <w:webHidden/>
               </w:rPr>
-              <w:t>37</w:t>
+              <w:t>43</w:t>
             </w:r>
             <w:r>
               <w:rPr>
@@ -2111,9 +2210,10 @@
               <w:noProof/>
               <w:kern w:val="2"/>
               <w:szCs w:val="24"/>
+              <w14:ligatures w14:val="standardContextual"/>
             </w:rPr>
           </w:pPr>
-          <w:hyperlink w:anchor="_Toc242971833" w:history="1">
+          <w:hyperlink w:anchor="_Toc242973016" w:history="1">
             <w:r>
               <w:rPr>
                 <w:rStyle w:val="Hyperlink"/>
@@ -2140,7 +2240,7 @@
                 <w:noProof/>
                 <w:webHidden/>
               </w:rPr>
-              <w:instrText xml:space="preserve"> PAGEREF _Toc242971833 \h </w:instrText>
+              <w:instrText xml:space="preserve"> PAGEREF _Toc242973016 \h </w:instrText>
             </w:r>
             <w:r>
               <w:rPr>
@@ -2160,7 +2260,7 @@
                 <w:noProof/>
                 <w:webHidden/>
               </w:rPr>
-              <w:t>38</w:t>
+              <w:t>44</w:t>
             </w:r>
             <w:r>
               <w:rPr>
@@ -2182,9 +2282,10 @@
               <w:noProof/>
               <w:kern w:val="2"/>
               <w:szCs w:val="24"/>
+              <w14:ligatures w14:val="standardContextual"/>
             </w:rPr>
           </w:pPr>
-          <w:hyperlink w:anchor="_Toc242971834" w:history="1">
+          <w:hyperlink w:anchor="_Toc242973017" w:history="1">
             <w:r>
               <w:rPr>
                 <w:rStyle w:val="Hyperlink"/>
@@ -2211,7 +2312,7 @@
                 <w:noProof/>
                 <w:webHidden/>
               </w:rPr>
-              <w:instrText xml:space="preserve"> PAGEREF _Toc242971834 \h </w:instrText>
+              <w:instrText xml:space="preserve"> PAGEREF _Toc242973017 \h </w:instrText>
             </w:r>
             <w:r>
               <w:rPr>
@@ -2231,7 +2332,7 @@
                 <w:noProof/>
                 <w:webHidden/>
               </w:rPr>
-              <w:t>39</w:t>
+              <w:t>45</w:t>
             </w:r>
             <w:r>
               <w:rPr>
@@ -2253,9 +2354,10 @@
               <w:noProof/>
               <w:kern w:val="2"/>
               <w:szCs w:val="24"/>
+              <w14:ligatures w14:val="standardContextual"/>
             </w:rPr>
           </w:pPr>
-          <w:hyperlink w:anchor="_Toc242971835" w:history="1">
+          <w:hyperlink w:anchor="_Toc242973018" w:history="1">
             <w:r>
               <w:rPr>
                 <w:rStyle w:val="Hyperlink"/>
@@ -2282,7 +2384,7 @@
                 <w:noProof/>
                 <w:webHidden/>
               </w:rPr>
-              <w:instrText xml:space="preserve"> PAGEREF _Toc242971835 \h </w:instrText>
+              <w:instrText xml:space="preserve"> PAGEREF _Toc242973018 \h </w:instrText>
             </w:r>
             <w:r>
               <w:rPr>
@@ -2302,7 +2404,7 @@
                 <w:noProof/>
                 <w:webHidden/>
               </w:rPr>
-              <w:t>39</w:t>
+              <w:t>45</w:t>
             </w:r>
             <w:r>
               <w:rPr>
@@ -2324,9 +2426,10 @@
               <w:noProof/>
               <w:kern w:val="2"/>
               <w:szCs w:val="24"/>
+              <w14:ligatures w14:val="standardContextual"/>
             </w:rPr>
           </w:pPr>
-          <w:hyperlink w:anchor="_Toc242971836" w:history="1">
+          <w:hyperlink w:anchor="_Toc242973019" w:history="1">
             <w:r>
               <w:rPr>
                 <w:rStyle w:val="Hyperlink"/>
@@ -2353,7 +2456,7 @@
                 <w:noProof/>
                 <w:webHidden/>
               </w:rPr>
-              <w:instrText xml:space="preserve"> PAGEREF _Toc242971836 \h </w:instrText>
+              <w:instrText xml:space="preserve"> PAGEREF _Toc242973019 \h </w:instrText>
             </w:r>
             <w:r>
               <w:rPr>
@@ -2373,7 +2476,7 @@
                 <w:noProof/>
                 <w:webHidden/>
               </w:rPr>
-              <w:t>39</w:t>
+              <w:t>45</w:t>
             </w:r>
             <w:r>
               <w:rPr>
@@ -2395,9 +2498,10 @@
               <w:noProof/>
               <w:kern w:val="2"/>
               <w:szCs w:val="24"/>
+              <w14:ligatures w14:val="standardContextual"/>
             </w:rPr>
           </w:pPr>
-          <w:hyperlink w:anchor="_Toc242971837" w:history="1">
+          <w:hyperlink w:anchor="_Toc242973020" w:history="1">
             <w:r>
               <w:rPr>
                 <w:rStyle w:val="Hyperlink"/>
@@ -2424,7 +2528,7 @@
                 <w:noProof/>
                 <w:webHidden/>
               </w:rPr>
-              <w:instrText xml:space="preserve"> PAGEREF _Toc242971837 \h </w:instrText>
+              <w:instrText xml:space="preserve"> PAGEREF _Toc242973020 \h </w:instrText>
             </w:r>
             <w:r>
               <w:rPr>
@@ -2444,7 +2548,7 @@
                 <w:noProof/>
                 <w:webHidden/>
               </w:rPr>
-              <w:t>42</w:t>
+              <w:t>48</w:t>
             </w:r>
             <w:r>
               <w:rPr>
@@ -2466,9 +2570,10 @@
               <w:noProof/>
               <w:kern w:val="2"/>
               <w:szCs w:val="24"/>
+              <w14:ligatures w14:val="standardContextual"/>
             </w:rPr>
           </w:pPr>
-          <w:hyperlink w:anchor="_Toc242971838" w:history="1">
+          <w:hyperlink w:anchor="_Toc242973021" w:history="1">
             <w:r>
               <w:rPr>
                 <w:rStyle w:val="Hyperlink"/>
@@ -2495,7 +2600,7 @@
                 <w:noProof/>
                 <w:webHidden/>
               </w:rPr>
-              <w:instrText xml:space="preserve"> PAGEREF _Toc242971838 \h </w:instrText>
+              <w:instrText xml:space="preserve"> PAGEREF _Toc242973021 \h </w:instrText>
             </w:r>
             <w:r>
               <w:rPr>
@@ -2515,7 +2620,7 @@
                 <w:noProof/>
                 <w:webHidden/>
               </w:rPr>
-              <w:t>43</w:t>
+              <w:t>49</w:t>
             </w:r>
             <w:r>
               <w:rPr>
@@ -2557,7 +2662,6 @@
         </w:rPr>
       </w:pPr>
       <w:bookmarkStart w:id="0" w:name="_Toc242971740"/>
-      <w:bookmarkStart w:id="1" w:name="_Toc242971808"/>
       <w:r>
         <w:br w:type="page"/>
       </w:r>
@@ -2566,6 +2670,7 @@
       <w:pPr>
         <w:pStyle w:val="Ttulo1"/>
       </w:pPr>
+      <w:bookmarkStart w:id="1" w:name="_Toc242972990"/>
       <w:r>
         <w:lastRenderedPageBreak/>
         <w:t>2. Contexto e Problema</w:t>
@@ -2590,7 +2695,7 @@
         <w:pStyle w:val="Ttulo1"/>
       </w:pPr>
       <w:bookmarkStart w:id="2" w:name="_Toc242971741"/>
-      <w:bookmarkStart w:id="3" w:name="_Toc242971809"/>
+      <w:bookmarkStart w:id="3" w:name="_Toc242972991"/>
       <w:r>
         <w:lastRenderedPageBreak/>
         <w:t>3. Público-alvo</w:t>
@@ -2607,7 +2712,7 @@
         </w:rPr>
       </w:pPr>
       <w:bookmarkStart w:id="4" w:name="_ah4wlfimp76z"/>
-      <w:bookmarkStart w:id="5" w:name="_Toc242971810"/>
+      <w:bookmarkStart w:id="5" w:name="_Toc242972992"/>
       <w:bookmarkEnd w:id="4"/>
       <w:r>
         <w:t>Atores</w:t>
@@ -3408,7 +3513,7 @@
       <w:pPr>
         <w:pStyle w:val="Ttulo1"/>
       </w:pPr>
-      <w:bookmarkStart w:id="6" w:name="_Toc242971811"/>
+      <w:bookmarkStart w:id="6" w:name="_Toc242972993"/>
       <w:r>
         <w:lastRenderedPageBreak/>
         <w:t>4. Escopo do Sistema</w:t>
@@ -3424,7 +3529,7 @@
       <w:pPr>
         <w:pStyle w:val="Ttulo1"/>
       </w:pPr>
-      <w:bookmarkStart w:id="7" w:name="_Toc242971812"/>
+      <w:bookmarkStart w:id="7" w:name="_Toc242972994"/>
       <w:r>
         <w:t>5. Levantamento de Requisitos</w:t>
       </w:r>
@@ -3439,7 +3544,7 @@
         </w:rPr>
       </w:pPr>
       <w:bookmarkStart w:id="8" w:name="_bk224p6b0cs5"/>
-      <w:bookmarkStart w:id="9" w:name="_Toc242971813"/>
+      <w:bookmarkStart w:id="9" w:name="_Toc242972995"/>
       <w:bookmarkEnd w:id="8"/>
       <w:r>
         <w:t>Requisitos Funcionais</w:t>
@@ -5023,7 +5128,7 @@
         <w:pStyle w:val="Ttulo2"/>
       </w:pPr>
       <w:bookmarkStart w:id="10" w:name="_e5xm515mtwds"/>
-      <w:bookmarkStart w:id="11" w:name="_Toc242971814"/>
+      <w:bookmarkStart w:id="11" w:name="_Toc242972996"/>
       <w:bookmarkEnd w:id="10"/>
       <w:r>
         <w:lastRenderedPageBreak/>
@@ -6084,7 +6189,7 @@
         <w:pStyle w:val="Ttulo2"/>
       </w:pPr>
       <w:bookmarkStart w:id="12" w:name="_bkiul8los9uq"/>
-      <w:bookmarkStart w:id="13" w:name="_Toc242971815"/>
+      <w:bookmarkStart w:id="13" w:name="_Toc242972997"/>
       <w:bookmarkEnd w:id="12"/>
       <w:r>
         <w:t>Diagrama de Casos de Uso</w:t>
@@ -6100,7 +6205,7 @@
           <w:noProof/>
         </w:rPr>
         <w:drawing>
-          <wp:inline distT="0" distB="0" distL="0" distR="0" wp14:anchorId="75B75BE2" wp14:editId="164CD421">
+          <wp:inline distT="0" distB="0" distL="0" distR="0" wp14:anchorId="371871FB" wp14:editId="3FD98D04">
             <wp:extent cx="5731510" cy="3924300"/>
             <wp:effectExtent l="0" t="0" r="0" b="0"/>
             <wp:docPr id="1" name="image5.png"/>
@@ -6153,7 +6258,7 @@
         <w:pStyle w:val="Ttulo2"/>
       </w:pPr>
       <w:bookmarkStart w:id="14" w:name="_10zldqaqifff"/>
-      <w:bookmarkStart w:id="15" w:name="_Toc242971816"/>
+      <w:bookmarkStart w:id="15" w:name="_Toc242972998"/>
       <w:bookmarkEnd w:id="14"/>
       <w:r>
         <w:lastRenderedPageBreak/>
@@ -9343,7 +9448,7 @@
       <w:pPr>
         <w:pStyle w:val="Ttulo1"/>
       </w:pPr>
-      <w:bookmarkStart w:id="16" w:name="_Toc242971817"/>
+      <w:bookmarkStart w:id="16" w:name="_Toc242972999"/>
       <w:r>
         <w:lastRenderedPageBreak/>
         <w:t>6. Artefato Técnico do Semestre</w:t>
@@ -9354,7 +9459,7 @@
       <w:pPr>
         <w:pStyle w:val="Ttulo2"/>
       </w:pPr>
-      <w:bookmarkStart w:id="17" w:name="_Toc242971818"/>
+      <w:bookmarkStart w:id="17" w:name="_Toc242973000"/>
       <w:r>
         <w:t xml:space="preserve">6.1 Interface e protótipo de </w:t>
       </w:r>
@@ -9380,7 +9485,7 @@
           <w:noProof/>
         </w:rPr>
         <w:drawing>
-          <wp:inline distT="0" distB="0" distL="0" distR="0" wp14:anchorId="1C72C68A" wp14:editId="7A3759B8">
+          <wp:inline distT="0" distB="0" distL="0" distR="0" wp14:anchorId="18039C56" wp14:editId="5D914676">
             <wp:extent cx="5733415" cy="3221990"/>
             <wp:effectExtent l="0" t="0" r="0" b="0"/>
             <wp:docPr id="2" name="Imagem 1"/>
@@ -9436,7 +9541,7 @@
           <w:noProof/>
         </w:rPr>
         <w:drawing>
-          <wp:inline distT="0" distB="0" distL="0" distR="0" wp14:anchorId="3879F3E3" wp14:editId="398E11AC">
+          <wp:inline distT="0" distB="0" distL="0" distR="0" wp14:anchorId="2949180D" wp14:editId="742C75DF">
             <wp:extent cx="5733415" cy="3220085"/>
             <wp:effectExtent l="0" t="0" r="0" b="0"/>
             <wp:docPr id="3" name="Image2"/>
@@ -9493,7 +9598,7 @@
         </w:rPr>
         <w:lastRenderedPageBreak/>
         <w:drawing>
-          <wp:inline distT="0" distB="0" distL="0" distR="0" wp14:anchorId="1A48D4E5" wp14:editId="771C0DC2">
+          <wp:inline distT="0" distB="0" distL="0" distR="0" wp14:anchorId="68B2F354" wp14:editId="342DDF84">
             <wp:extent cx="5733415" cy="3203575"/>
             <wp:effectExtent l="0" t="0" r="0" b="0"/>
             <wp:docPr id="4" name="Image3"/>
@@ -9549,7 +9654,7 @@
           <w:noProof/>
         </w:rPr>
         <w:drawing>
-          <wp:inline distT="0" distB="0" distL="0" distR="0" wp14:anchorId="0A48D101" wp14:editId="2686BADA">
+          <wp:inline distT="0" distB="0" distL="0" distR="0" wp14:anchorId="5EE4AA69" wp14:editId="056A67B9">
             <wp:extent cx="5733415" cy="3228975"/>
             <wp:effectExtent l="0" t="0" r="0" b="0"/>
             <wp:docPr id="5" name="Image4"/>
@@ -9606,7 +9711,7 @@
         </w:rPr>
         <w:lastRenderedPageBreak/>
         <w:drawing>
-          <wp:inline distT="0" distB="0" distL="0" distR="0" wp14:anchorId="19BB0C79" wp14:editId="37DA382D">
+          <wp:inline distT="0" distB="0" distL="0" distR="0" wp14:anchorId="5E19D50F" wp14:editId="200F8AC6">
             <wp:extent cx="5733415" cy="3219450"/>
             <wp:effectExtent l="0" t="0" r="0" b="0"/>
             <wp:docPr id="6" name="Image5"/>
@@ -9662,7 +9767,7 @@
           <w:noProof/>
         </w:rPr>
         <w:drawing>
-          <wp:inline distT="0" distB="0" distL="0" distR="0" wp14:anchorId="49A9F55B" wp14:editId="18368A30">
+          <wp:inline distT="0" distB="0" distL="0" distR="0" wp14:anchorId="0F4B9E1B" wp14:editId="62FD32EB">
             <wp:extent cx="5733415" cy="3209290"/>
             <wp:effectExtent l="0" t="0" r="0" b="0"/>
             <wp:docPr id="7" name="Image6"/>
@@ -9719,7 +9824,7 @@
       <w:pPr>
         <w:pStyle w:val="Ttulo2"/>
       </w:pPr>
-      <w:bookmarkStart w:id="18" w:name="_Toc242971819"/>
+      <w:bookmarkStart w:id="18" w:name="_Toc242973001"/>
       <w:r>
         <w:lastRenderedPageBreak/>
         <w:t>6.2 Modelo Entidade-Relacionamento (MER)</w:t>
@@ -9732,7 +9837,7 @@
           <w:noProof/>
         </w:rPr>
         <w:drawing>
-          <wp:inline distT="0" distB="0" distL="0" distR="0" wp14:anchorId="2809687F" wp14:editId="0EB27F41">
+          <wp:inline distT="0" distB="0" distL="0" distR="0" wp14:anchorId="26975BA8" wp14:editId="17A4004B">
             <wp:extent cx="5731510" cy="7524750"/>
             <wp:effectExtent l="0" t="0" r="0" b="0"/>
             <wp:docPr id="14" name="Imagem 14"/>
@@ -9780,7 +9885,7 @@
       <w:pPr>
         <w:pStyle w:val="Ttulo2"/>
       </w:pPr>
-      <w:bookmarkStart w:id="19" w:name="_Toc242971820"/>
+      <w:bookmarkStart w:id="19" w:name="_Toc242973002"/>
       <w:r>
         <w:lastRenderedPageBreak/>
         <w:t>6.3 Esquema físico do banco de dados e script DDL</w:t>
@@ -9823,7 +9928,7 @@
           <w:sz w:val="20"/>
           <w:szCs w:val="20"/>
         </w:rPr>
-        <w:t>-- DDL MySQL 8.0+ - Sistema de atendimento e vendas de pacotes de viagem</w:t>
+        <w:t>-- DDL MySQL 8.0.16+ - Sistema de atendimento e vendas de pacotes de viagem</w:t>
       </w:r>
     </w:p>
     <w:p>
@@ -10031,7 +10136,7 @@
           <w:sz w:val="20"/>
           <w:szCs w:val="20"/>
         </w:rPr>
-        <w:t>-- USUARIO (RF01, RF02)</w:t>
+        <w:t>-- USUARIO (RF11, RF12)</w:t>
       </w:r>
     </w:p>
     <w:p>
@@ -10789,43 +10894,7 @@
           <w:sz w:val="20"/>
           <w:szCs w:val="20"/>
         </w:rPr>
-        <w:t xml:space="preserve">-- TOKEN_REDEFINICAO (RF02 - </w:t>
-      </w:r>
-      <w:proofErr w:type="spellStart"/>
-      <w:r>
-        <w:rPr>
-          <w:rFonts w:cs="Times New Roman"/>
-          <w:sz w:val="20"/>
-          <w:szCs w:val="20"/>
-        </w:rPr>
-        <w:t>redefinicao</w:t>
-      </w:r>
-      <w:proofErr w:type="spellEnd"/>
-      <w:r>
-        <w:rPr>
-          <w:rFonts w:cs="Times New Roman"/>
-          <w:sz w:val="20"/>
-          <w:szCs w:val="20"/>
-        </w:rPr>
-        <w:t xml:space="preserve"> de senha com token de uso </w:t>
-      </w:r>
-      <w:proofErr w:type="spellStart"/>
-      <w:r>
-        <w:rPr>
-          <w:rFonts w:cs="Times New Roman"/>
-          <w:sz w:val="20"/>
-          <w:szCs w:val="20"/>
-        </w:rPr>
-        <w:t>unico</w:t>
-      </w:r>
-      <w:proofErr w:type="spellEnd"/>
-      <w:r>
-        <w:rPr>
-          <w:rFonts w:cs="Times New Roman"/>
-          <w:sz w:val="20"/>
-          <w:szCs w:val="20"/>
-        </w:rPr>
-        <w:t>)</w:t>
+        <w:t>-- TOKEN_REDEFINICAO (RF12 - redefinicao de senha com token de uso unico)</w:t>
       </w:r>
     </w:p>
     <w:p>
@@ -11358,7 +11427,7 @@
           <w:sz w:val="20"/>
           <w:szCs w:val="20"/>
         </w:rPr>
-        <w:t>-- ETAPA_FUNIL (RF07)</w:t>
+        <w:t>-- ETAPA_FUNIL (RF15)</w:t>
       </w:r>
     </w:p>
     <w:p>
@@ -11718,7 +11787,7 @@
           <w:sz w:val="20"/>
           <w:szCs w:val="20"/>
         </w:rPr>
-        <w:t>-- CLIENTE (RF03, RF04, RF05)</w:t>
+        <w:t>-- CLIENTE (RF03, RF13, RF17)</w:t>
       </w:r>
     </w:p>
     <w:p>
@@ -12973,7 +13042,7 @@
           <w:sz w:val="20"/>
           <w:szCs w:val="20"/>
         </w:rPr>
-        <w:t>-- INTERESSE_DESTINO (N:N cliente x destino - filtro do RF04)</w:t>
+        <w:t>-- INTERESSE_DESTINO (N:N cliente x destino - filtro do RF13)</w:t>
       </w:r>
     </w:p>
     <w:p>
@@ -13968,7 +14037,7 @@
           <w:sz w:val="20"/>
           <w:szCs w:val="20"/>
         </w:rPr>
-        <w:t>-- TAREFA (RF06, RF08)</w:t>
+        <w:t>-- TAREFA (RF14, RF16)</w:t>
       </w:r>
     </w:p>
     <w:p>
@@ -14654,7 +14723,7 @@
           <w:sz w:val="20"/>
           <w:szCs w:val="20"/>
         </w:rPr>
-        <w:t>-- HISTORICO (RF04, RF05, RF06, RF07)</w:t>
+        <w:t>-- HISTORICO (RF13, RF14, RF15, RF17)</w:t>
       </w:r>
     </w:p>
     <w:p>
@@ -17130,7 +17199,7 @@
           <w:sz w:val="20"/>
           <w:szCs w:val="20"/>
         </w:rPr>
-        <w:t>-- Dados iniciais: etapas do funil (exemplos do RF07)</w:t>
+        <w:t>-- Dados iniciais: etapas do funil (exemplos do RF15)</w:t>
       </w:r>
     </w:p>
     <w:p>
@@ -17255,9 +17324,9 @@
       <w:pPr>
         <w:pStyle w:val="Ttulo2"/>
       </w:pPr>
-      <w:bookmarkStart w:id="20" w:name="_Toc242971821"/>
-      <w:r>
-        <w:t>6.4 Plano inicial de segurança e LGPD</w:t>
+      <w:bookmarkStart w:id="20" w:name="_Toc242973004"/>
+      <w:r>
+        <w:t>6.5 Plano inicial de segurança e LGPD</w:t>
       </w:r>
       <w:bookmarkEnd w:id="20"/>
     </w:p>
@@ -17283,12 +17352,2211 @@
       </w:r>
     </w:p>
     <w:p>
+      <w:r>
+        <w:t>O projeto adota MySQL 8.0.16 ou superior, com mecanismo InnoDB e conjunto de caracteres utf8mb4, conforme o script DDL da seção 6.3. Os controles de acesso, auditoria, criptografia, backups e rede descritos a seguir são requisitos de implantação e não são todos criados pelo DDL.</w:t>
+      </w:r>
+    </w:p>
+    <w:p>
+      <w:pPr>
+        <w:rPr>
+          <w:b/>
+          <w:bCs/>
+        </w:rPr>
+      </w:pPr>
+      <w:r>
+        <w:rPr>
+          <w:b/>
+          <w:bCs/>
+        </w:rPr>
+        <w:t>6.5.1 Ativos e classificação dos dados</w:t>
+      </w:r>
+    </w:p>
+    <w:tbl>
+      <w:tblPr>
+        <w:tblW w:w="0" w:type="auto"/>
+        <w:tblCellSpacing w:w="15" w:type="dxa"/>
+        <w:tblBorders>
+          <w:top w:val="single" w:sz="4" w:space="0" w:color="auto"/>
+          <w:left w:val="single" w:sz="4" w:space="0" w:color="auto"/>
+          <w:bottom w:val="single" w:sz="4" w:space="0" w:color="auto"/>
+          <w:right w:val="single" w:sz="4" w:space="0" w:color="auto"/>
+          <w:insideH w:val="single" w:sz="4" w:space="0" w:color="auto"/>
+          <w:insideV w:val="single" w:sz="4" w:space="0" w:color="auto"/>
+        </w:tblBorders>
+        <w:tblCellMar>
+          <w:top w:w="15" w:type="dxa"/>
+          <w:left w:w="15" w:type="dxa"/>
+          <w:bottom w:w="15" w:type="dxa"/>
+          <w:right w:w="15" w:type="dxa"/>
+        </w:tblCellMar>
+        <w:tblLook w:val="04A0" w:firstRow="1" w:lastRow="0" w:firstColumn="1" w:lastColumn="0" w:noHBand="0" w:noVBand="1"/>
+      </w:tblPr>
+      <w:tblGrid>
+        <w:gridCol w:w="3374"/>
+        <w:gridCol w:w="1672"/>
+        <w:gridCol w:w="1899"/>
+        <w:gridCol w:w="2191"/>
+      </w:tblGrid>
+      <w:tr>
+        <w:trPr>
+          <w:tblHeader/>
+          <w:tblCellSpacing w:w="15" w:type="dxa"/>
+        </w:trPr>
+        <w:tc>
+          <w:tcPr>
+            <w:tcW w:w="0" w:type="auto"/>
+            <w:vAlign w:val="center"/>
+            <w:hideMark/>
+          </w:tcPr>
+          <w:p>
+            <w:pPr>
+              <w:rPr>
+                <w:b/>
+                <w:bCs/>
+              </w:rPr>
+            </w:pPr>
+            <w:r>
+              <w:rPr>
+                <w:b/>
+                <w:bCs/>
+              </w:rPr>
+              <w:t>Dado</w:t>
+            </w:r>
+          </w:p>
+        </w:tc>
+        <w:tc>
+          <w:tcPr>
+            <w:tcW w:w="0" w:type="auto"/>
+            <w:vAlign w:val="center"/>
+            <w:hideMark/>
+          </w:tcPr>
+          <w:p>
+            <w:pPr>
+              <w:rPr>
+                <w:b/>
+                <w:bCs/>
+              </w:rPr>
+            </w:pPr>
+            <w:r>
+              <w:rPr>
+                <w:b/>
+                <w:bCs/>
+              </w:rPr>
+              <w:t>Onde aparece</w:t>
+            </w:r>
+          </w:p>
+        </w:tc>
+        <w:tc>
+          <w:tcPr>
+            <w:tcW w:w="0" w:type="auto"/>
+            <w:vAlign w:val="center"/>
+            <w:hideMark/>
+          </w:tcPr>
+          <w:p>
+            <w:pPr>
+              <w:rPr>
+                <w:b/>
+                <w:bCs/>
+              </w:rPr>
+            </w:pPr>
+            <w:r>
+              <w:rPr>
+                <w:b/>
+                <w:bCs/>
+              </w:rPr>
+              <w:t>Classificação</w:t>
+            </w:r>
+          </w:p>
+        </w:tc>
+        <w:tc>
+          <w:tcPr>
+            <w:tcW w:w="0" w:type="auto"/>
+            <w:vAlign w:val="center"/>
+            <w:hideMark/>
+          </w:tcPr>
+          <w:p>
+            <w:pPr>
+              <w:rPr>
+                <w:b/>
+                <w:bCs/>
+              </w:rPr>
+            </w:pPr>
+            <w:r>
+              <w:rPr>
+                <w:b/>
+                <w:bCs/>
+              </w:rPr>
+              <w:t>Risco principal</w:t>
+            </w:r>
+          </w:p>
+        </w:tc>
+      </w:tr>
+      <w:tr>
+        <w:trPr>
+          <w:tblCellSpacing w:w="15" w:type="dxa"/>
+        </w:trPr>
+        <w:tc>
+          <w:tcPr>
+            <w:tcW w:w="0" w:type="auto"/>
+            <w:vAlign w:val="center"/>
+            <w:hideMark/>
+          </w:tcPr>
+          <w:p>
+            <w:r>
+              <w:t>Senha de funcionários</w:t>
+            </w:r>
+          </w:p>
+        </w:tc>
+        <w:tc>
+          <w:tcPr>
+            <w:tcW w:w="0" w:type="auto"/>
+            <w:vAlign w:val="center"/>
+            <w:hideMark/>
+          </w:tcPr>
+          <w:p>
+            <w:r>
+              <w:t>RF11, RF12</w:t>
+            </w:r>
+          </w:p>
+        </w:tc>
+        <w:tc>
+          <w:tcPr>
+            <w:tcW w:w="0" w:type="auto"/>
+            <w:vAlign w:val="center"/>
+            <w:hideMark/>
+          </w:tcPr>
+          <w:p>
+            <w:r>
+              <w:t>Crítico</w:t>
+            </w:r>
+          </w:p>
+        </w:tc>
+        <w:tc>
+          <w:tcPr>
+            <w:tcW w:w="0" w:type="auto"/>
+            <w:vAlign w:val="center"/>
+            <w:hideMark/>
+          </w:tcPr>
+          <w:p>
+            <w:r>
+              <w:t>Vazamento e reuso de credencial</w:t>
+            </w:r>
+          </w:p>
+        </w:tc>
+      </w:tr>
+      <w:tr>
+        <w:trPr>
+          <w:tblCellSpacing w:w="15" w:type="dxa"/>
+        </w:trPr>
+        <w:tc>
+          <w:tcPr>
+            <w:tcW w:w="0" w:type="auto"/>
+            <w:vAlign w:val="center"/>
+            <w:hideMark/>
+          </w:tcPr>
+          <w:p>
+            <w:r>
+              <w:t xml:space="preserve">CPF, e-mail, telefone e </w:t>
+            </w:r>
+            <w:r>
+              <w:t>endereço de clientes e funcionários</w:t>
+            </w:r>
+          </w:p>
+        </w:tc>
+        <w:tc>
+          <w:tcPr>
+            <w:tcW w:w="0" w:type="auto"/>
+            <w:vAlign w:val="center"/>
+            <w:hideMark/>
+          </w:tcPr>
+          <w:p>
+            <w:r>
+              <w:t>RF03, RF11, RF13, RF17</w:t>
+            </w:r>
+          </w:p>
+        </w:tc>
+        <w:tc>
+          <w:tcPr>
+            <w:tcW w:w="0" w:type="auto"/>
+            <w:vAlign w:val="center"/>
+            <w:hideMark/>
+          </w:tcPr>
+          <w:p>
+            <w:r>
+              <w:t>Pessoal (LGPD)</w:t>
+            </w:r>
+          </w:p>
+        </w:tc>
+        <w:tc>
+          <w:tcPr>
+            <w:tcW w:w="0" w:type="auto"/>
+            <w:vAlign w:val="center"/>
+            <w:hideMark/>
+          </w:tcPr>
+          <w:p>
+            <w:r>
+              <w:t>Vazamento, uso indevido</w:t>
+            </w:r>
+          </w:p>
+        </w:tc>
+      </w:tr>
+      <w:tr>
+        <w:trPr>
+          <w:tblCellSpacing w:w="15" w:type="dxa"/>
+        </w:trPr>
+        <w:tc>
+          <w:tcPr>
+            <w:tcW w:w="0" w:type="auto"/>
+            <w:vAlign w:val="center"/>
+            <w:hideMark/>
+          </w:tcPr>
+          <w:p>
+            <w:r>
+              <w:t>Vendas, faturamento e comissões</w:t>
+            </w:r>
+          </w:p>
+        </w:tc>
+        <w:tc>
+          <w:tcPr>
+            <w:tcW w:w="0" w:type="auto"/>
+            <w:vAlign w:val="center"/>
+            <w:hideMark/>
+          </w:tcPr>
+          <w:p>
+            <w:r>
+              <w:t>RF09</w:t>
+            </w:r>
+          </w:p>
+        </w:tc>
+        <w:tc>
+          <w:tcPr>
+            <w:tcW w:w="0" w:type="auto"/>
+            <w:vAlign w:val="center"/>
+            <w:hideMark/>
+          </w:tcPr>
+          <w:p>
+            <w:r>
+              <w:t>Confidencial (só Gestor)</w:t>
+            </w:r>
+          </w:p>
+        </w:tc>
+        <w:tc>
+          <w:tcPr>
+            <w:tcW w:w="0" w:type="auto"/>
+            <w:vAlign w:val="center"/>
+            <w:hideMark/>
+          </w:tcPr>
+          <w:p>
+            <w:r>
+              <w:t>Acesso indevido pelo Atendente</w:t>
+            </w:r>
+          </w:p>
+        </w:tc>
+      </w:tr>
+      <w:tr>
+        <w:trPr>
+          <w:tblCellSpacing w:w="15" w:type="dxa"/>
+        </w:trPr>
+        <w:tc>
+          <w:tcPr>
+            <w:tcW w:w="0" w:type="auto"/>
+            <w:vAlign w:val="center"/>
+            <w:hideMark/>
+          </w:tcPr>
+          <w:p>
+            <w:r>
+              <w:lastRenderedPageBreak/>
+              <w:t>Tarefas, fases e histórico de atendimento</w:t>
+            </w:r>
+          </w:p>
+        </w:tc>
+        <w:tc>
+          <w:tcPr>
+            <w:tcW w:w="0" w:type="auto"/>
+            <w:vAlign w:val="center"/>
+            <w:hideMark/>
+          </w:tcPr>
+          <w:p>
+            <w:r>
+              <w:t>RF14, RF15, RF16</w:t>
+            </w:r>
+          </w:p>
+        </w:tc>
+        <w:tc>
+          <w:tcPr>
+            <w:tcW w:w="0" w:type="auto"/>
+            <w:vAlign w:val="center"/>
+            <w:hideMark/>
+          </w:tcPr>
+          <w:p>
+            <w:r>
+              <w:t>Interno</w:t>
+            </w:r>
+          </w:p>
+        </w:tc>
+        <w:tc>
+          <w:tcPr>
+            <w:tcW w:w="0" w:type="auto"/>
+            <w:vAlign w:val="center"/>
+            <w:hideMark/>
+          </w:tcPr>
+          <w:p>
+            <w:r>
+              <w:t>Alteração indevida</w:t>
+            </w:r>
+          </w:p>
+        </w:tc>
+      </w:tr>
+    </w:tbl>
+    <w:p>
+      <w:pPr>
+        <w:rPr>
+          <w:b/>
+          <w:bCs/>
+        </w:rPr>
+      </w:pPr>
+    </w:p>
+    <w:p>
+      <w:pPr>
+        <w:rPr>
+          <w:b/>
+          <w:bCs/>
+        </w:rPr>
+      </w:pPr>
+    </w:p>
+    <w:p>
+      <w:pPr>
+        <w:rPr>
+          <w:b/>
+          <w:bCs/>
+        </w:rPr>
+      </w:pPr>
+      <w:r>
+        <w:rPr>
+          <w:b/>
+          <w:bCs/>
+        </w:rPr>
+        <w:t>6.5.2 Ameaças e controles</w:t>
+      </w:r>
+    </w:p>
+    <w:tbl>
+      <w:tblPr>
+        <w:tblW w:w="0" w:type="auto"/>
+        <w:tblCellSpacing w:w="15" w:type="dxa"/>
+        <w:tblCellMar>
+          <w:top w:w="15" w:type="dxa"/>
+          <w:left w:w="15" w:type="dxa"/>
+          <w:bottom w:w="15" w:type="dxa"/>
+          <w:right w:w="15" w:type="dxa"/>
+        </w:tblCellMar>
+        <w:tblLook w:val="04A0" w:firstRow="1" w:lastRow="0" w:firstColumn="1" w:lastColumn="0" w:noHBand="0" w:noVBand="1"/>
+      </w:tblPr>
+      <w:tblGrid>
+        <w:gridCol w:w="3977"/>
+        <w:gridCol w:w="3732"/>
+        <w:gridCol w:w="1427"/>
+      </w:tblGrid>
+      <w:tr>
+        <w:trPr>
+          <w:tblHeader/>
+          <w:tblCellSpacing w:w="15" w:type="dxa"/>
+        </w:trPr>
+        <w:tc>
+          <w:tcPr>
+            <w:tcW w:w="0" w:type="auto"/>
+            <w:tcBorders>
+              <w:top w:val="single" w:sz="4" w:space="0" w:color="auto"/>
+              <w:left w:val="single" w:sz="4" w:space="0" w:color="auto"/>
+              <w:bottom w:val="single" w:sz="4" w:space="0" w:color="auto"/>
+              <w:right w:val="single" w:sz="4" w:space="0" w:color="auto"/>
+            </w:tcBorders>
+            <w:vAlign w:val="center"/>
+            <w:hideMark/>
+          </w:tcPr>
+          <w:p>
+            <w:pPr>
+              <w:rPr>
+                <w:b/>
+                <w:bCs/>
+              </w:rPr>
+            </w:pPr>
+            <w:r>
+              <w:rPr>
+                <w:b/>
+                <w:bCs/>
+              </w:rPr>
+              <w:t>Ameaça</w:t>
+            </w:r>
+          </w:p>
+        </w:tc>
+        <w:tc>
+          <w:tcPr>
+            <w:tcW w:w="0" w:type="auto"/>
+            <w:tcBorders>
+              <w:top w:val="single" w:sz="4" w:space="0" w:color="auto"/>
+              <w:left w:val="single" w:sz="4" w:space="0" w:color="auto"/>
+              <w:bottom w:val="single" w:sz="4" w:space="0" w:color="auto"/>
+              <w:right w:val="single" w:sz="4" w:space="0" w:color="auto"/>
+            </w:tcBorders>
+            <w:vAlign w:val="center"/>
+            <w:hideMark/>
+          </w:tcPr>
+          <w:p>
+            <w:pPr>
+              <w:rPr>
+                <w:b/>
+                <w:bCs/>
+              </w:rPr>
+            </w:pPr>
+            <w:r>
+              <w:rPr>
+                <w:b/>
+                <w:bCs/>
+              </w:rPr>
+              <w:t>Controle no SGBD</w:t>
+            </w:r>
+          </w:p>
+        </w:tc>
+        <w:tc>
+          <w:tcPr>
+            <w:tcW w:w="0" w:type="auto"/>
+            <w:tcBorders>
+              <w:top w:val="single" w:sz="4" w:space="0" w:color="auto"/>
+              <w:left w:val="single" w:sz="4" w:space="0" w:color="auto"/>
+              <w:bottom w:val="single" w:sz="4" w:space="0" w:color="auto"/>
+              <w:right w:val="single" w:sz="4" w:space="0" w:color="auto"/>
+            </w:tcBorders>
+            <w:vAlign w:val="center"/>
+            <w:hideMark/>
+          </w:tcPr>
+          <w:p>
+            <w:pPr>
+              <w:rPr>
+                <w:b/>
+                <w:bCs/>
+              </w:rPr>
+            </w:pPr>
+            <w:r>
+              <w:rPr>
+                <w:b/>
+                <w:bCs/>
+              </w:rPr>
+              <w:t>Requisito</w:t>
+            </w:r>
+          </w:p>
+        </w:tc>
+      </w:tr>
+      <w:tr>
+        <w:trPr>
+          <w:tblCellSpacing w:w="15" w:type="dxa"/>
+        </w:trPr>
+        <w:tc>
+          <w:tcPr>
+            <w:tcW w:w="0" w:type="auto"/>
+            <w:tcBorders>
+              <w:top w:val="single" w:sz="4" w:space="0" w:color="auto"/>
+              <w:left w:val="single" w:sz="4" w:space="0" w:color="auto"/>
+              <w:bottom w:val="single" w:sz="4" w:space="0" w:color="auto"/>
+              <w:right w:val="single" w:sz="4" w:space="0" w:color="auto"/>
+            </w:tcBorders>
+            <w:vAlign w:val="center"/>
+            <w:hideMark/>
+          </w:tcPr>
+          <w:p>
+            <w:r>
+              <w:rPr>
+                <w:i/>
+                <w:iCs/>
+              </w:rPr>
+              <w:t>SQL injection nas buscas de clientes (RF13) e formulários (RF11, RF17)</w:t>
+            </w:r>
+          </w:p>
+        </w:tc>
+        <w:tc>
+          <w:tcPr>
+            <w:tcW w:w="0" w:type="auto"/>
+            <w:tcBorders>
+              <w:top w:val="single" w:sz="4" w:space="0" w:color="auto"/>
+              <w:left w:val="single" w:sz="4" w:space="0" w:color="auto"/>
+              <w:bottom w:val="single" w:sz="4" w:space="0" w:color="auto"/>
+              <w:right w:val="single" w:sz="4" w:space="0" w:color="auto"/>
+            </w:tcBorders>
+            <w:vAlign w:val="center"/>
+            <w:hideMark/>
+          </w:tcPr>
+          <w:p>
+            <w:r>
+              <w:t>Consultas parametrizadas e conta da aplicação sem permissão de DDL</w:t>
+            </w:r>
+          </w:p>
+        </w:tc>
+        <w:tc>
+          <w:tcPr>
+            <w:tcW w:w="0" w:type="auto"/>
+            <w:tcBorders>
+              <w:top w:val="single" w:sz="4" w:space="0" w:color="auto"/>
+              <w:left w:val="single" w:sz="4" w:space="0" w:color="auto"/>
+              <w:bottom w:val="single" w:sz="4" w:space="0" w:color="auto"/>
+              <w:right w:val="single" w:sz="4" w:space="0" w:color="auto"/>
+            </w:tcBorders>
+            <w:vAlign w:val="center"/>
+            <w:hideMark/>
+          </w:tcPr>
+          <w:p>
+            <w:r>
+              <w:t>RNF01</w:t>
+            </w:r>
+          </w:p>
+        </w:tc>
+      </w:tr>
+      <w:tr>
+        <w:trPr>
+          <w:tblCellSpacing w:w="15" w:type="dxa"/>
+        </w:trPr>
+        <w:tc>
+          <w:tcPr>
+            <w:tcW w:w="0" w:type="auto"/>
+            <w:tcBorders>
+              <w:top w:val="single" w:sz="4" w:space="0" w:color="auto"/>
+              <w:left w:val="single" w:sz="4" w:space="0" w:color="auto"/>
+              <w:bottom w:val="single" w:sz="4" w:space="0" w:color="auto"/>
+              <w:right w:val="single" w:sz="4" w:space="0" w:color="auto"/>
+            </w:tcBorders>
+            <w:vAlign w:val="center"/>
+            <w:hideMark/>
+          </w:tcPr>
+          <w:p>
+            <w:r>
+              <w:t xml:space="preserve">Atendente </w:t>
+            </w:r>
+            <w:r>
+              <w:t>acessando dados de vendas</w:t>
+            </w:r>
+          </w:p>
+        </w:tc>
+        <w:tc>
+          <w:tcPr>
+            <w:tcW w:w="0" w:type="auto"/>
+            <w:tcBorders>
+              <w:top w:val="single" w:sz="4" w:space="0" w:color="auto"/>
+              <w:left w:val="single" w:sz="4" w:space="0" w:color="auto"/>
+              <w:bottom w:val="single" w:sz="4" w:space="0" w:color="auto"/>
+              <w:right w:val="single" w:sz="4" w:space="0" w:color="auto"/>
+            </w:tcBorders>
+            <w:vAlign w:val="center"/>
+            <w:hideMark/>
+          </w:tcPr>
+          <w:p>
+            <w:r>
+              <w:t>Papéis (</w:t>
+            </w:r>
+            <w:r>
+              <w:rPr>
+                <w:i/>
+                <w:iCs/>
+              </w:rPr>
+              <w:t>roles</w:t>
+            </w:r>
+            <w:r>
+              <w:t>) separados por perfil e GRANT mínimo</w:t>
+            </w:r>
+          </w:p>
+        </w:tc>
+        <w:tc>
+          <w:tcPr>
+            <w:tcW w:w="0" w:type="auto"/>
+            <w:tcBorders>
+              <w:top w:val="single" w:sz="4" w:space="0" w:color="auto"/>
+              <w:left w:val="single" w:sz="4" w:space="0" w:color="auto"/>
+              <w:bottom w:val="single" w:sz="4" w:space="0" w:color="auto"/>
+              <w:right w:val="single" w:sz="4" w:space="0" w:color="auto"/>
+            </w:tcBorders>
+            <w:vAlign w:val="center"/>
+            <w:hideMark/>
+          </w:tcPr>
+          <w:p>
+            <w:r>
+              <w:t>RF09</w:t>
+            </w:r>
+          </w:p>
+        </w:tc>
+      </w:tr>
+      <w:tr>
+        <w:trPr>
+          <w:tblCellSpacing w:w="15" w:type="dxa"/>
+        </w:trPr>
+        <w:tc>
+          <w:tcPr>
+            <w:tcW w:w="0" w:type="auto"/>
+            <w:tcBorders>
+              <w:top w:val="single" w:sz="4" w:space="0" w:color="auto"/>
+              <w:left w:val="single" w:sz="4" w:space="0" w:color="auto"/>
+              <w:bottom w:val="single" w:sz="4" w:space="0" w:color="auto"/>
+              <w:right w:val="single" w:sz="4" w:space="0" w:color="auto"/>
+            </w:tcBorders>
+            <w:vAlign w:val="center"/>
+            <w:hideMark/>
+          </w:tcPr>
+          <w:p>
+            <w:r>
+              <w:t>Vazamento do banco (backup ou disco roubado)</w:t>
+            </w:r>
+          </w:p>
+        </w:tc>
+        <w:tc>
+          <w:tcPr>
+            <w:tcW w:w="0" w:type="auto"/>
+            <w:tcBorders>
+              <w:top w:val="single" w:sz="4" w:space="0" w:color="auto"/>
+              <w:left w:val="single" w:sz="4" w:space="0" w:color="auto"/>
+              <w:bottom w:val="single" w:sz="4" w:space="0" w:color="auto"/>
+              <w:right w:val="single" w:sz="4" w:space="0" w:color="auto"/>
+            </w:tcBorders>
+            <w:vAlign w:val="center"/>
+            <w:hideMark/>
+          </w:tcPr>
+          <w:p>
+            <w:r>
+              <w:t xml:space="preserve">Criptografia em repouso e senhas só como </w:t>
+            </w:r>
+            <w:proofErr w:type="spellStart"/>
+            <w:r>
+              <w:t>hash</w:t>
+            </w:r>
+            <w:proofErr w:type="spellEnd"/>
+          </w:p>
+        </w:tc>
+        <w:tc>
+          <w:tcPr>
+            <w:tcW w:w="0" w:type="auto"/>
+            <w:tcBorders>
+              <w:top w:val="single" w:sz="4" w:space="0" w:color="auto"/>
+              <w:left w:val="single" w:sz="4" w:space="0" w:color="auto"/>
+              <w:bottom w:val="single" w:sz="4" w:space="0" w:color="auto"/>
+              <w:right w:val="single" w:sz="4" w:space="0" w:color="auto"/>
+            </w:tcBorders>
+            <w:vAlign w:val="center"/>
+            <w:hideMark/>
+          </w:tcPr>
+          <w:p>
+            <w:r>
+              <w:t>RNF01</w:t>
+            </w:r>
+          </w:p>
+        </w:tc>
+      </w:tr>
+      <w:tr>
+        <w:trPr>
+          <w:tblCellSpacing w:w="15" w:type="dxa"/>
+        </w:trPr>
+        <w:tc>
+          <w:tcPr>
+            <w:tcW w:w="0" w:type="auto"/>
+            <w:tcBorders>
+              <w:top w:val="single" w:sz="4" w:space="0" w:color="auto"/>
+              <w:left w:val="single" w:sz="4" w:space="0" w:color="auto"/>
+              <w:bottom w:val="single" w:sz="4" w:space="0" w:color="auto"/>
+              <w:right w:val="single" w:sz="4" w:space="0" w:color="auto"/>
+            </w:tcBorders>
+            <w:vAlign w:val="center"/>
+            <w:hideMark/>
+          </w:tcPr>
+          <w:p>
+            <w:r>
+              <w:t>Interceptação entre aplicação e banco</w:t>
+            </w:r>
+          </w:p>
+        </w:tc>
+        <w:tc>
+          <w:tcPr>
+            <w:tcW w:w="0" w:type="auto"/>
+            <w:tcBorders>
+              <w:top w:val="single" w:sz="4" w:space="0" w:color="auto"/>
+              <w:left w:val="single" w:sz="4" w:space="0" w:color="auto"/>
+              <w:bottom w:val="single" w:sz="4" w:space="0" w:color="auto"/>
+              <w:right w:val="single" w:sz="4" w:space="0" w:color="auto"/>
+            </w:tcBorders>
+            <w:vAlign w:val="center"/>
+            <w:hideMark/>
+          </w:tcPr>
+          <w:p>
+            <w:r>
+              <w:t>TLS obrigatório na conexão</w:t>
+            </w:r>
+          </w:p>
+        </w:tc>
+        <w:tc>
+          <w:tcPr>
+            <w:tcW w:w="0" w:type="auto"/>
+            <w:tcBorders>
+              <w:top w:val="single" w:sz="4" w:space="0" w:color="auto"/>
+              <w:left w:val="single" w:sz="4" w:space="0" w:color="auto"/>
+              <w:bottom w:val="single" w:sz="4" w:space="0" w:color="auto"/>
+              <w:right w:val="single" w:sz="4" w:space="0" w:color="auto"/>
+            </w:tcBorders>
+            <w:vAlign w:val="center"/>
+            <w:hideMark/>
+          </w:tcPr>
+          <w:p>
+            <w:r>
+              <w:t>RNF01</w:t>
+            </w:r>
+          </w:p>
+        </w:tc>
+      </w:tr>
+      <w:tr>
+        <w:trPr>
+          <w:tblCellSpacing w:w="15" w:type="dxa"/>
+        </w:trPr>
+        <w:tc>
+          <w:tcPr>
+            <w:tcW w:w="0" w:type="auto"/>
+            <w:tcBorders>
+              <w:top w:val="single" w:sz="4" w:space="0" w:color="auto"/>
+              <w:left w:val="single" w:sz="4" w:space="0" w:color="auto"/>
+              <w:bottom w:val="single" w:sz="4" w:space="0" w:color="auto"/>
+              <w:right w:val="single" w:sz="4" w:space="0" w:color="auto"/>
+            </w:tcBorders>
+            <w:vAlign w:val="center"/>
+            <w:hideMark/>
+          </w:tcPr>
+          <w:p>
+            <w:r>
+              <w:t>Dados duplicados ou inconsistentes (CPF, e-mail)</w:t>
+            </w:r>
+          </w:p>
+        </w:tc>
+        <w:tc>
+          <w:tcPr>
+            <w:tcW w:w="0" w:type="auto"/>
+            <w:tcBorders>
+              <w:top w:val="single" w:sz="4" w:space="0" w:color="auto"/>
+              <w:left w:val="single" w:sz="4" w:space="0" w:color="auto"/>
+              <w:bottom w:val="single" w:sz="4" w:space="0" w:color="auto"/>
+              <w:right w:val="single" w:sz="4" w:space="0" w:color="auto"/>
+            </w:tcBorders>
+            <w:vAlign w:val="center"/>
+            <w:hideMark/>
+          </w:tcPr>
+          <w:p>
+            <w:r>
+              <w:t>Restrições UNIQUE, FK, CHECK, NOT NULL</w:t>
+            </w:r>
+          </w:p>
+        </w:tc>
+        <w:tc>
+          <w:tcPr>
+            <w:tcW w:w="0" w:type="auto"/>
+            <w:tcBorders>
+              <w:top w:val="single" w:sz="4" w:space="0" w:color="auto"/>
+              <w:left w:val="single" w:sz="4" w:space="0" w:color="auto"/>
+              <w:bottom w:val="single" w:sz="4" w:space="0" w:color="auto"/>
+              <w:right w:val="single" w:sz="4" w:space="0" w:color="auto"/>
+            </w:tcBorders>
+            <w:vAlign w:val="center"/>
+            <w:hideMark/>
+          </w:tcPr>
+          <w:p>
+            <w:r>
+              <w:t>RF11, RF14, RF17</w:t>
+            </w:r>
+          </w:p>
+        </w:tc>
+      </w:tr>
+      <w:tr>
+        <w:trPr>
+          <w:tblCellSpacing w:w="15" w:type="dxa"/>
+        </w:trPr>
+        <w:tc>
+          <w:tcPr>
+            <w:tcW w:w="0" w:type="auto"/>
+            <w:tcBorders>
+              <w:top w:val="single" w:sz="4" w:space="0" w:color="auto"/>
+              <w:left w:val="single" w:sz="4" w:space="0" w:color="auto"/>
+              <w:bottom w:val="single" w:sz="4" w:space="0" w:color="auto"/>
+              <w:right w:val="single" w:sz="4" w:space="0" w:color="auto"/>
+            </w:tcBorders>
+            <w:vAlign w:val="center"/>
+            <w:hideMark/>
+          </w:tcPr>
+          <w:p>
+            <w:r>
+              <w:t>Falha no meio de uma atualização</w:t>
+            </w:r>
+          </w:p>
+        </w:tc>
+        <w:tc>
+          <w:tcPr>
+            <w:tcW w:w="0" w:type="auto"/>
+            <w:tcBorders>
+              <w:top w:val="single" w:sz="4" w:space="0" w:color="auto"/>
+              <w:left w:val="single" w:sz="4" w:space="0" w:color="auto"/>
+              <w:bottom w:val="single" w:sz="4" w:space="0" w:color="auto"/>
+              <w:right w:val="single" w:sz="4" w:space="0" w:color="auto"/>
+            </w:tcBorders>
+            <w:vAlign w:val="center"/>
+            <w:hideMark/>
+          </w:tcPr>
+          <w:p>
+            <w:r>
+              <w:t xml:space="preserve">Transações ACID com </w:t>
+            </w:r>
+            <w:proofErr w:type="spellStart"/>
+            <w:r>
+              <w:rPr>
+                <w:i/>
+                <w:iCs/>
+              </w:rPr>
+              <w:t>rollback</w:t>
+            </w:r>
+            <w:proofErr w:type="spellEnd"/>
+          </w:p>
+        </w:tc>
+        <w:tc>
+          <w:tcPr>
+            <w:tcW w:w="0" w:type="auto"/>
+            <w:tcBorders>
+              <w:top w:val="single" w:sz="4" w:space="0" w:color="auto"/>
+              <w:left w:val="single" w:sz="4" w:space="0" w:color="auto"/>
+              <w:bottom w:val="single" w:sz="4" w:space="0" w:color="auto"/>
+              <w:right w:val="single" w:sz="4" w:space="0" w:color="auto"/>
+            </w:tcBorders>
+            <w:vAlign w:val="center"/>
+            <w:hideMark/>
+          </w:tcPr>
+          <w:p>
+            <w:r>
+              <w:t>RF17</w:t>
+            </w:r>
+          </w:p>
+        </w:tc>
+      </w:tr>
+      <w:tr>
+        <w:trPr>
+          <w:tblCellSpacing w:w="15" w:type="dxa"/>
+        </w:trPr>
+        <w:tc>
+          <w:tcPr>
+            <w:tcW w:w="0" w:type="auto"/>
+            <w:tcBorders>
+              <w:top w:val="single" w:sz="4" w:space="0" w:color="auto"/>
+              <w:left w:val="single" w:sz="4" w:space="0" w:color="auto"/>
+              <w:bottom w:val="single" w:sz="4" w:space="0" w:color="auto"/>
+              <w:right w:val="single" w:sz="4" w:space="0" w:color="auto"/>
+            </w:tcBorders>
+            <w:vAlign w:val="center"/>
+            <w:hideMark/>
+          </w:tcPr>
+          <w:p>
+            <w:r>
+              <w:t>Força bruta no login</w:t>
+            </w:r>
+          </w:p>
+        </w:tc>
+        <w:tc>
+          <w:tcPr>
+            <w:tcW w:w="0" w:type="auto"/>
+            <w:tcBorders>
+              <w:top w:val="single" w:sz="4" w:space="0" w:color="auto"/>
+              <w:left w:val="single" w:sz="4" w:space="0" w:color="auto"/>
+              <w:bottom w:val="single" w:sz="4" w:space="0" w:color="auto"/>
+              <w:right w:val="single" w:sz="4" w:space="0" w:color="auto"/>
+            </w:tcBorders>
+            <w:vAlign w:val="center"/>
+            <w:hideMark/>
+          </w:tcPr>
+          <w:p>
+            <w:r>
+              <w:t>Contador de falhas e bloqueio persistidos no banco</w:t>
+            </w:r>
+          </w:p>
+        </w:tc>
+        <w:tc>
+          <w:tcPr>
+            <w:tcW w:w="0" w:type="auto"/>
+            <w:tcBorders>
+              <w:top w:val="single" w:sz="4" w:space="0" w:color="auto"/>
+              <w:left w:val="single" w:sz="4" w:space="0" w:color="auto"/>
+              <w:bottom w:val="single" w:sz="4" w:space="0" w:color="auto"/>
+              <w:right w:val="single" w:sz="4" w:space="0" w:color="auto"/>
+            </w:tcBorders>
+            <w:vAlign w:val="center"/>
+            <w:hideMark/>
+          </w:tcPr>
+          <w:p>
+            <w:r>
+              <w:t>RF12</w:t>
+            </w:r>
+          </w:p>
+        </w:tc>
+      </w:tr>
+      <w:tr>
+        <w:trPr>
+          <w:tblCellSpacing w:w="15" w:type="dxa"/>
+        </w:trPr>
+        <w:tc>
+          <w:tcPr>
+            <w:tcW w:w="0" w:type="auto"/>
+            <w:tcBorders>
+              <w:top w:val="single" w:sz="4" w:space="0" w:color="auto"/>
+              <w:left w:val="single" w:sz="4" w:space="0" w:color="auto"/>
+              <w:bottom w:val="single" w:sz="4" w:space="0" w:color="auto"/>
+              <w:right w:val="single" w:sz="4" w:space="0" w:color="auto"/>
+            </w:tcBorders>
+            <w:vAlign w:val="center"/>
+            <w:hideMark/>
+          </w:tcPr>
+          <w:p>
+            <w:r>
+              <w:t>Alteração ou exclusão sem rastro</w:t>
+            </w:r>
+          </w:p>
+        </w:tc>
+        <w:tc>
+          <w:tcPr>
+            <w:tcW w:w="0" w:type="auto"/>
+            <w:tcBorders>
+              <w:top w:val="single" w:sz="4" w:space="0" w:color="auto"/>
+              <w:left w:val="single" w:sz="4" w:space="0" w:color="auto"/>
+              <w:bottom w:val="single" w:sz="4" w:space="0" w:color="auto"/>
+              <w:right w:val="single" w:sz="4" w:space="0" w:color="auto"/>
+            </w:tcBorders>
+            <w:vAlign w:val="center"/>
+            <w:hideMark/>
+          </w:tcPr>
+          <w:p>
+            <w:r>
+              <w:t xml:space="preserve">Tabela de auditoria alimentada por </w:t>
+            </w:r>
+            <w:r>
+              <w:rPr>
+                <w:i/>
+                <w:iCs/>
+              </w:rPr>
+              <w:t>triggers</w:t>
+            </w:r>
+          </w:p>
+        </w:tc>
+        <w:tc>
+          <w:tcPr>
+            <w:tcW w:w="0" w:type="auto"/>
+            <w:tcBorders>
+              <w:top w:val="single" w:sz="4" w:space="0" w:color="auto"/>
+              <w:left w:val="single" w:sz="4" w:space="0" w:color="auto"/>
+              <w:bottom w:val="single" w:sz="4" w:space="0" w:color="auto"/>
+              <w:right w:val="single" w:sz="4" w:space="0" w:color="auto"/>
+            </w:tcBorders>
+            <w:vAlign w:val="center"/>
+            <w:hideMark/>
+          </w:tcPr>
+          <w:p>
+            <w:r>
+              <w:t>RNF01</w:t>
+            </w:r>
+          </w:p>
+        </w:tc>
+      </w:tr>
+      <w:tr>
+        <w:trPr>
+          <w:tblCellSpacing w:w="15" w:type="dxa"/>
+        </w:trPr>
+        <w:tc>
+          <w:tcPr>
+            <w:tcW w:w="0" w:type="auto"/>
+            <w:tcBorders>
+              <w:top w:val="single" w:sz="4" w:space="0" w:color="auto"/>
+              <w:left w:val="single" w:sz="4" w:space="0" w:color="auto"/>
+              <w:bottom w:val="single" w:sz="4" w:space="0" w:color="auto"/>
+              <w:right w:val="single" w:sz="4" w:space="0" w:color="auto"/>
+            </w:tcBorders>
+            <w:vAlign w:val="center"/>
+            <w:hideMark/>
+          </w:tcPr>
+          <w:p>
+            <w:r>
+              <w:t>Perda de dados ou indisponibilidade</w:t>
+            </w:r>
+          </w:p>
+        </w:tc>
+        <w:tc>
+          <w:tcPr>
+            <w:tcW w:w="0" w:type="auto"/>
+            <w:tcBorders>
+              <w:top w:val="single" w:sz="4" w:space="0" w:color="auto"/>
+              <w:left w:val="single" w:sz="4" w:space="0" w:color="auto"/>
+              <w:bottom w:val="single" w:sz="4" w:space="0" w:color="auto"/>
+              <w:right w:val="single" w:sz="4" w:space="0" w:color="auto"/>
+            </w:tcBorders>
+            <w:vAlign w:val="center"/>
+            <w:hideMark/>
+          </w:tcPr>
+          <w:p>
+            <w:r>
+              <w:t>Backup, restauração testada e réplica</w:t>
+            </w:r>
+          </w:p>
+        </w:tc>
+        <w:tc>
+          <w:tcPr>
+            <w:tcW w:w="0" w:type="auto"/>
+            <w:tcBorders>
+              <w:top w:val="single" w:sz="4" w:space="0" w:color="auto"/>
+              <w:left w:val="single" w:sz="4" w:space="0" w:color="auto"/>
+              <w:bottom w:val="single" w:sz="4" w:space="0" w:color="auto"/>
+              <w:right w:val="single" w:sz="4" w:space="0" w:color="auto"/>
+            </w:tcBorders>
+            <w:vAlign w:val="center"/>
+            <w:hideMark/>
+          </w:tcPr>
+          <w:p>
+            <w:r>
+              <w:t>RNF03</w:t>
+            </w:r>
+          </w:p>
+        </w:tc>
+      </w:tr>
+    </w:tbl>
+    <w:p>
+      <w:pPr>
+        <w:rPr>
+          <w:b/>
+          <w:bCs/>
+        </w:rPr>
+      </w:pPr>
+    </w:p>
+    <w:p>
+      <w:pPr>
+        <w:rPr>
+          <w:b/>
+          <w:bCs/>
+        </w:rPr>
+      </w:pPr>
+      <w:r>
+        <w:rPr>
+          <w:b/>
+          <w:bCs/>
+        </w:rPr>
+        <w:lastRenderedPageBreak/>
+        <w:t>6.5.3 Controles detalhados</w:t>
+      </w:r>
+    </w:p>
+    <w:p>
+      <w:pPr>
+        <w:rPr>
+          <w:b/>
+          <w:bCs/>
+        </w:rPr>
+      </w:pPr>
+      <w:r>
+        <w:rPr>
+          <w:b/>
+          <w:bCs/>
+        </w:rPr>
+        <w:t>6.5.3.1 Contas e acesso à rede</w:t>
+      </w:r>
+    </w:p>
+    <w:p>
+      <w:pPr>
+        <w:numPr>
+          <w:ilvl w:val="0"/>
+          <w:numId w:val="1"/>
+        </w:numPr>
+      </w:pPr>
+      <w:r>
+        <w:t xml:space="preserve">Contas separadas por função: </w:t>
+      </w:r>
+      <w:proofErr w:type="spellStart"/>
+      <w:r>
+        <w:t>dono_schema</w:t>
+      </w:r>
+      <w:proofErr w:type="spellEnd"/>
+      <w:r>
+        <w:t xml:space="preserve"> (só para </w:t>
+      </w:r>
+      <w:proofErr w:type="spellStart"/>
+      <w:r>
+        <w:rPr>
+          <w:i/>
+          <w:iCs/>
+        </w:rPr>
+        <w:t>migrations</w:t>
+      </w:r>
+      <w:proofErr w:type="spellEnd"/>
+      <w:r>
+        <w:t xml:space="preserve">), </w:t>
+      </w:r>
+      <w:proofErr w:type="spellStart"/>
+      <w:r>
+        <w:t>app_atendente</w:t>
+      </w:r>
+      <w:proofErr w:type="spellEnd"/>
+      <w:r>
+        <w:t xml:space="preserve">, </w:t>
+      </w:r>
+      <w:proofErr w:type="spellStart"/>
+      <w:r>
+        <w:t>app_gestor</w:t>
+      </w:r>
+      <w:proofErr w:type="spellEnd"/>
+      <w:r>
+        <w:t xml:space="preserve"> (inclui leitura de vendas) e </w:t>
+      </w:r>
+      <w:proofErr w:type="spellStart"/>
+      <w:r>
+        <w:t>backup_user</w:t>
+      </w:r>
+      <w:proofErr w:type="spellEnd"/>
+      <w:r>
+        <w:t xml:space="preserve">. A aplicação </w:t>
+      </w:r>
+      <w:r>
+        <w:rPr>
+          <w:b/>
+          <w:bCs/>
+        </w:rPr>
+        <w:t>nunca</w:t>
+      </w:r>
+      <w:r>
+        <w:t xml:space="preserve"> usa root ou </w:t>
+      </w:r>
+      <w:proofErr w:type="spellStart"/>
+      <w:r>
+        <w:t>superusuário</w:t>
+      </w:r>
+      <w:proofErr w:type="spellEnd"/>
+      <w:r>
+        <w:t>.</w:t>
+      </w:r>
+    </w:p>
+    <w:p>
+      <w:pPr>
+        <w:numPr>
+          <w:ilvl w:val="0"/>
+          <w:numId w:val="1"/>
+        </w:numPr>
+      </w:pPr>
+      <w:r>
+        <w:t>O SGBD roda em rede privada, sem porta exposta à internet. Só o servidor da aplicação (IP em lista de permissão) conecta.</w:t>
+      </w:r>
+    </w:p>
+    <w:p>
+      <w:pPr>
+        <w:numPr>
+          <w:ilvl w:val="0"/>
+          <w:numId w:val="1"/>
+        </w:numPr>
+      </w:pPr>
+      <w:r>
+        <w:t>As senhas das contas de banco ficam em variáveis de ambiente ou cofre de segredos, nunca no código-fonte nem no repositório.</w:t>
+      </w:r>
+    </w:p>
+    <w:p/>
+    <w:p>
+      <w:pPr>
+        <w:rPr>
+          <w:b/>
+          <w:bCs/>
+        </w:rPr>
+      </w:pPr>
+      <w:r>
+        <w:rPr>
+          <w:b/>
+          <w:bCs/>
+        </w:rPr>
+        <w:t>6.5.3.2 Privilégio mínimo por perfil</w:t>
+      </w:r>
+    </w:p>
+    <w:p>
+      <w:r>
+        <w:t xml:space="preserve">O RBAC da aplicação é repetido no banco como defesa em profundidade, com um </w:t>
+      </w:r>
+      <w:r>
+        <w:rPr>
+          <w:i/>
+          <w:iCs/>
+        </w:rPr>
+        <w:t>pool</w:t>
+      </w:r>
+      <w:r>
+        <w:t xml:space="preserve"> de conexão por perfil.</w:t>
+      </w:r>
+    </w:p>
+    <w:tbl>
+      <w:tblPr>
+        <w:tblW w:w="0" w:type="auto"/>
+        <w:tblCellSpacing w:w="15" w:type="dxa"/>
+        <w:tblBorders>
+          <w:top w:val="single" w:sz="4" w:space="0" w:color="auto"/>
+          <w:left w:val="single" w:sz="4" w:space="0" w:color="auto"/>
+          <w:bottom w:val="single" w:sz="4" w:space="0" w:color="auto"/>
+          <w:right w:val="single" w:sz="4" w:space="0" w:color="auto"/>
+          <w:insideH w:val="single" w:sz="4" w:space="0" w:color="auto"/>
+          <w:insideV w:val="single" w:sz="4" w:space="0" w:color="auto"/>
+        </w:tblBorders>
+        <w:tblCellMar>
+          <w:top w:w="15" w:type="dxa"/>
+          <w:left w:w="15" w:type="dxa"/>
+          <w:bottom w:w="15" w:type="dxa"/>
+          <w:right w:w="15" w:type="dxa"/>
+        </w:tblCellMar>
+        <w:tblLook w:val="04A0" w:firstRow="1" w:lastRow="0" w:firstColumn="1" w:lastColumn="0" w:noHBand="0" w:noVBand="1"/>
+      </w:tblPr>
+      <w:tblGrid>
+        <w:gridCol w:w="2888"/>
+        <w:gridCol w:w="3086"/>
+        <w:gridCol w:w="3002"/>
+      </w:tblGrid>
+      <w:tr>
+        <w:trPr>
+          <w:tblHeader/>
+          <w:tblCellSpacing w:w="15" w:type="dxa"/>
+        </w:trPr>
+        <w:tc>
+          <w:tcPr>
+            <w:tcW w:w="0" w:type="auto"/>
+            <w:vAlign w:val="center"/>
+            <w:hideMark/>
+          </w:tcPr>
+          <w:p>
+            <w:pPr>
+              <w:rPr>
+                <w:b/>
+                <w:bCs/>
+              </w:rPr>
+            </w:pPr>
+            <w:r>
+              <w:rPr>
+                <w:b/>
+                <w:bCs/>
+              </w:rPr>
+              <w:t>Objeto</w:t>
+            </w:r>
+          </w:p>
+        </w:tc>
+        <w:tc>
+          <w:tcPr>
+            <w:tcW w:w="0" w:type="auto"/>
+            <w:vAlign w:val="center"/>
+            <w:hideMark/>
+          </w:tcPr>
+          <w:p>
+            <w:pPr>
+              <w:rPr>
+                <w:b/>
+                <w:bCs/>
+              </w:rPr>
+            </w:pPr>
+            <w:r>
+              <w:rPr>
+                <w:b/>
+                <w:bCs/>
+              </w:rPr>
+              <w:t>Atendente</w:t>
+            </w:r>
+          </w:p>
+        </w:tc>
+        <w:tc>
+          <w:tcPr>
+            <w:tcW w:w="0" w:type="auto"/>
+            <w:vAlign w:val="center"/>
+            <w:hideMark/>
+          </w:tcPr>
+          <w:p>
+            <w:pPr>
+              <w:rPr>
+                <w:b/>
+                <w:bCs/>
+              </w:rPr>
+            </w:pPr>
+            <w:r>
+              <w:rPr>
+                <w:b/>
+                <w:bCs/>
+              </w:rPr>
+              <w:t>Gestor</w:t>
+            </w:r>
+          </w:p>
+        </w:tc>
+      </w:tr>
+      <w:tr>
+        <w:trPr>
+          <w:tblCellSpacing w:w="15" w:type="dxa"/>
+        </w:trPr>
+        <w:tc>
+          <w:tcPr>
+            <w:tcW w:w="0" w:type="auto"/>
+            <w:vAlign w:val="center"/>
+            <w:hideMark/>
+          </w:tcPr>
+          <w:p>
+            <w:r>
+              <w:t>clientes</w:t>
+            </w:r>
+          </w:p>
+        </w:tc>
+        <w:tc>
+          <w:tcPr>
+            <w:tcW w:w="0" w:type="auto"/>
+            <w:vAlign w:val="center"/>
+            <w:hideMark/>
+          </w:tcPr>
+          <w:p>
+            <w:r>
+              <w:t>SELECT, INSERT, UPDATE</w:t>
+            </w:r>
+          </w:p>
+        </w:tc>
+        <w:tc>
+          <w:tcPr>
+            <w:tcW w:w="0" w:type="auto"/>
+            <w:vAlign w:val="center"/>
+            <w:hideMark/>
+          </w:tcPr>
+          <w:p>
+            <w:r>
+              <w:t>SELECT, UPDATE</w:t>
+            </w:r>
+          </w:p>
+        </w:tc>
+      </w:tr>
+      <w:tr>
+        <w:trPr>
+          <w:tblCellSpacing w:w="15" w:type="dxa"/>
+        </w:trPr>
+        <w:tc>
+          <w:tcPr>
+            <w:tcW w:w="0" w:type="auto"/>
+            <w:vAlign w:val="center"/>
+            <w:hideMark/>
+          </w:tcPr>
+          <w:p>
+            <w:r>
+              <w:t>tarefas</w:t>
+            </w:r>
+          </w:p>
+        </w:tc>
+        <w:tc>
+          <w:tcPr>
+            <w:tcW w:w="0" w:type="auto"/>
+            <w:vAlign w:val="center"/>
+            <w:hideMark/>
+          </w:tcPr>
+          <w:p>
+            <w:r>
+              <w:t>SELECT, INSERT, UPDATE</w:t>
+            </w:r>
+          </w:p>
+        </w:tc>
+        <w:tc>
+          <w:tcPr>
+            <w:tcW w:w="0" w:type="auto"/>
+            <w:vAlign w:val="center"/>
+            <w:hideMark/>
+          </w:tcPr>
+          <w:p>
+            <w:r>
+              <w:t>SELECT</w:t>
+            </w:r>
+          </w:p>
+        </w:tc>
+      </w:tr>
+      <w:tr>
+        <w:trPr>
+          <w:tblCellSpacing w:w="15" w:type="dxa"/>
+        </w:trPr>
+        <w:tc>
+          <w:tcPr>
+            <w:tcW w:w="0" w:type="auto"/>
+            <w:vAlign w:val="center"/>
+            <w:hideMark/>
+          </w:tcPr>
+          <w:p>
+            <w:proofErr w:type="spellStart"/>
+            <w:r>
+              <w:t>usuarios</w:t>
+            </w:r>
+            <w:proofErr w:type="spellEnd"/>
+          </w:p>
+        </w:tc>
+        <w:tc>
+          <w:tcPr>
+            <w:tcW w:w="0" w:type="auto"/>
+            <w:vAlign w:val="center"/>
+            <w:hideMark/>
+          </w:tcPr>
+          <w:p>
+            <w:r>
+              <w:t>só leitura da própria linha</w:t>
+            </w:r>
+          </w:p>
+        </w:tc>
+        <w:tc>
+          <w:tcPr>
+            <w:tcW w:w="0" w:type="auto"/>
+            <w:vAlign w:val="center"/>
+            <w:hideMark/>
+          </w:tcPr>
+          <w:p>
+            <w:r>
+              <w:t>SELECT, INSERT, UPDATE</w:t>
+            </w:r>
+          </w:p>
+        </w:tc>
+      </w:tr>
+      <w:tr>
+        <w:trPr>
+          <w:tblCellSpacing w:w="15" w:type="dxa"/>
+        </w:trPr>
+        <w:tc>
+          <w:tcPr>
+            <w:tcW w:w="0" w:type="auto"/>
+            <w:vAlign w:val="center"/>
+            <w:hideMark/>
+          </w:tcPr>
+          <w:p>
+            <w:r>
+              <w:t>vendas</w:t>
+            </w:r>
+          </w:p>
+        </w:tc>
+        <w:tc>
+          <w:tcPr>
+            <w:tcW w:w="0" w:type="auto"/>
+            <w:vAlign w:val="center"/>
+            <w:hideMark/>
+          </w:tcPr>
+          <w:p>
+            <w:r>
+              <w:t>sem acesso</w:t>
+            </w:r>
+          </w:p>
+        </w:tc>
+        <w:tc>
+          <w:tcPr>
+            <w:tcW w:w="0" w:type="auto"/>
+            <w:vAlign w:val="center"/>
+            <w:hideMark/>
+          </w:tcPr>
+          <w:p>
+            <w:r>
+              <w:t>SELECT</w:t>
+            </w:r>
+          </w:p>
+        </w:tc>
+      </w:tr>
+      <w:tr>
+        <w:trPr>
+          <w:tblCellSpacing w:w="15" w:type="dxa"/>
+        </w:trPr>
+        <w:tc>
+          <w:tcPr>
+            <w:tcW w:w="0" w:type="auto"/>
+            <w:vAlign w:val="center"/>
+            <w:hideMark/>
+          </w:tcPr>
+          <w:p>
+            <w:r>
+              <w:t>auditoria</w:t>
+            </w:r>
+          </w:p>
+        </w:tc>
+        <w:tc>
+          <w:tcPr>
+            <w:tcW w:w="0" w:type="auto"/>
+            <w:vAlign w:val="center"/>
+            <w:hideMark/>
+          </w:tcPr>
+          <w:p>
+            <w:r>
+              <w:t>sem acesso</w:t>
+            </w:r>
+          </w:p>
+        </w:tc>
+        <w:tc>
+          <w:tcPr>
+            <w:tcW w:w="0" w:type="auto"/>
+            <w:vAlign w:val="center"/>
+            <w:hideMark/>
+          </w:tcPr>
+          <w:p>
+            <w:r>
+              <w:t>SELECT</w:t>
+            </w:r>
+          </w:p>
+        </w:tc>
+      </w:tr>
+      <w:tr>
+        <w:trPr>
+          <w:tblCellSpacing w:w="15" w:type="dxa"/>
+        </w:trPr>
+        <w:tc>
+          <w:tcPr>
+            <w:tcW w:w="0" w:type="auto"/>
+            <w:vAlign w:val="center"/>
+            <w:hideMark/>
+          </w:tcPr>
+          <w:p>
+            <w:r>
+              <w:t>DELETE em qualquer tabela</w:t>
+            </w:r>
+          </w:p>
+        </w:tc>
+        <w:tc>
+          <w:tcPr>
+            <w:tcW w:w="0" w:type="auto"/>
+            <w:vAlign w:val="center"/>
+            <w:hideMark/>
+          </w:tcPr>
+          <w:p>
+            <w:r>
+              <w:t>negado (usar inativação lógica)</w:t>
+            </w:r>
+          </w:p>
+        </w:tc>
+        <w:tc>
+          <w:tcPr>
+            <w:tcW w:w="0" w:type="auto"/>
+            <w:vAlign w:val="center"/>
+            <w:hideMark/>
+          </w:tcPr>
+          <w:p>
+            <w:r>
+              <w:t>negado</w:t>
+            </w:r>
+          </w:p>
+        </w:tc>
+      </w:tr>
+    </w:tbl>
+    <w:p/>
+    <w:p>
+      <w:pPr>
+        <w:rPr>
+          <w:b/>
+          <w:bCs/>
+        </w:rPr>
+      </w:pPr>
+      <w:r>
+        <w:t>6.5.3.3 Integridade, transações e desempenho</w:t>
+      </w:r>
+    </w:p>
+    <w:p>
+      <w:r>
+        <w:t xml:space="preserve">Restrições de unicidade para CPF e e-mail de funcionários (RF11) e CPF de clientes (RF17) protegem os dados </w:t>
+      </w:r>
+      <w:r>
+        <w:t xml:space="preserve">mesmo se a validação da aplicação falhar. O prazo da tarefa é validado pela aplicação (RF14). Atualizações de pedidos (RF10) e clientes (RF17) devem usar </w:t>
+      </w:r>
+      <w:r>
+        <w:lastRenderedPageBreak/>
+        <w:t>transações com rollback em caso de erro. Índices nos campos de busca de clientes e vendas apoiam o limite de 10 segundos de consultas e relatórios definido em RNF06.</w:t>
+      </w:r>
+    </w:p>
+    <w:p>
+      <w:pPr>
+        <w:rPr>
+          <w:b/>
+          <w:bCs/>
+        </w:rPr>
+      </w:pPr>
+      <w:r>
+        <w:rPr>
+          <w:b/>
+          <w:bCs/>
+        </w:rPr>
+        <w:t>6.5.3.4 Proteção dos dados</w:t>
+      </w:r>
+    </w:p>
+    <w:p>
+      <w:pPr>
+        <w:numPr>
+          <w:ilvl w:val="0"/>
+          <w:numId w:val="2"/>
+        </w:numPr>
+      </w:pPr>
+      <w:r>
+        <w:rPr>
+          <w:b/>
+          <w:bCs/>
+        </w:rPr>
+        <w:t>Senhas:</w:t>
+      </w:r>
+      <w:r>
+        <w:t xml:space="preserve"> o </w:t>
+      </w:r>
+      <w:proofErr w:type="spellStart"/>
+      <w:r>
+        <w:t>hash</w:t>
+      </w:r>
+      <w:proofErr w:type="spellEnd"/>
+      <w:r>
+        <w:t xml:space="preserve"> (</w:t>
+      </w:r>
+      <w:proofErr w:type="spellStart"/>
+      <w:r>
+        <w:t>bcrypt</w:t>
+      </w:r>
+      <w:proofErr w:type="spellEnd"/>
+      <w:r>
+        <w:t xml:space="preserve"> ou Argon2id) é gerado na aplicação, e o banco guarda só </w:t>
+      </w:r>
+      <w:proofErr w:type="spellStart"/>
+      <w:r>
+        <w:t>senha_hash</w:t>
+      </w:r>
+      <w:proofErr w:type="spellEnd"/>
+      <w:r>
+        <w:t>.</w:t>
+      </w:r>
+    </w:p>
+    <w:p>
+      <w:pPr>
+        <w:numPr>
+          <w:ilvl w:val="0"/>
+          <w:numId w:val="2"/>
+        </w:numPr>
+      </w:pPr>
+      <w:r>
+        <w:rPr>
+          <w:b/>
+          <w:bCs/>
+        </w:rPr>
+        <w:t>Em trânsito: conexões com o MySQL devem usar TLS 1.2 ou superior, com validação do certificado configurada no driver.</w:t>
+      </w:r>
+    </w:p>
+    <w:p>
+      <w:pPr>
+        <w:numPr>
+          <w:ilvl w:val="0"/>
+          <w:numId w:val="2"/>
+        </w:numPr>
+      </w:pPr>
+      <w:r>
+        <w:rPr>
+          <w:b/>
+          <w:bCs/>
+        </w:rPr>
+        <w:t>Em repouso:</w:t>
+      </w:r>
+      <w:r>
+        <w:t xml:space="preserve"> criptografia do volume ou do banco (TDE) e dos arquivos de backup.</w:t>
+      </w:r>
+    </w:p>
+    <w:p>
+      <w:pPr>
+        <w:numPr>
+          <w:ilvl w:val="0"/>
+          <w:numId w:val="2"/>
+        </w:numPr>
+      </w:pPr>
+      <w:r>
+        <w:rPr>
+          <w:b/>
+          <w:bCs/>
+        </w:rPr>
+        <w:t>CPF: como é usado em busca (RF13), criptografar a coluna dificultaria a consulta. Manter em claro com criptografia de disco é o mais simples e adequado ao escopo. Se quiser mais proteção, guarde também um HMAC do CPF só para pesquisa.</w:t>
+      </w:r>
+    </w:p>
+    <w:p>
+      <w:pPr>
+        <w:numPr>
+          <w:ilvl w:val="0"/>
+          <w:numId w:val="2"/>
+        </w:numPr>
+      </w:pPr>
+      <w:r>
+        <w:rPr>
+          <w:b/>
+          <w:bCs/>
+        </w:rPr>
+        <w:t>Mascaramento:</w:t>
+      </w:r>
+      <w:r>
+        <w:t xml:space="preserve"> a interface e os logs exibem o CPF mascarado (***.456.789-**), salvo na tela de detalhe do cliente.</w:t>
+      </w:r>
+    </w:p>
+    <w:p/>
+    <w:p>
+      <w:pPr>
+        <w:rPr>
+          <w:b/>
+          <w:bCs/>
+        </w:rPr>
+      </w:pPr>
+      <w:r>
+        <w:rPr>
+          <w:b/>
+          <w:bCs/>
+        </w:rPr>
+        <w:t>6.5.3.5 Auditoria</w:t>
+      </w:r>
+    </w:p>
+    <w:p>
+      <w:r>
+        <w:t>Triggers nas tabelas cliente, usuario e venda devem registrar quem alterou, quando e o valor anterior. O log do SGBD também registra falhas de autenticação, mudanças de privilégio e comandos DDL. Para a aplicação, a tabela auditoria é somente de inserção, e só o Gestor lê.</w:t>
+      </w:r>
+    </w:p>
+    <w:p/>
+    <w:p>
+      <w:pPr>
+        <w:rPr>
+          <w:b/>
+          <w:bCs/>
+        </w:rPr>
+      </w:pPr>
+      <w:r>
+        <w:rPr>
+          <w:b/>
+          <w:bCs/>
+        </w:rPr>
+        <w:t>6.5.3.6 Backup e recuperação (RNF03)</w:t>
+      </w:r>
+    </w:p>
+    <w:p>
+      <w:pPr>
+        <w:numPr>
+          <w:ilvl w:val="0"/>
+          <w:numId w:val="3"/>
+        </w:numPr>
+      </w:pPr>
+      <w:r>
+        <w:rPr>
+          <w:b/>
+          <w:bCs/>
+        </w:rPr>
+        <w:t>Rotina: backup completo diário, mais arquivamento contínuo do binlog do MySQL para recuperação ponto no tempo.</w:t>
+      </w:r>
+    </w:p>
+    <w:p>
+      <w:pPr>
+        <w:numPr>
+          <w:ilvl w:val="0"/>
+          <w:numId w:val="3"/>
+        </w:numPr>
+      </w:pPr>
+      <w:r>
+        <w:rPr>
+          <w:b/>
+          <w:bCs/>
+        </w:rPr>
+        <w:t>Janela: os backups pesados rodam entre 00:00 e 05:00, a janela de manutenção definida no RNF03.</w:t>
+      </w:r>
+    </w:p>
+    <w:p>
+      <w:pPr>
+        <w:numPr>
+          <w:ilvl w:val="0"/>
+          <w:numId w:val="3"/>
+        </w:numPr>
+      </w:pPr>
+      <w:r>
+        <w:rPr>
+          <w:b/>
+          <w:bCs/>
+        </w:rPr>
+        <w:t>Metas:</w:t>
+      </w:r>
+      <w:r>
+        <w:t xml:space="preserve"> RPO (perda máxima de dados) de 15 minutos e RTO (tempo para restaurar) de 4 horas.</w:t>
+      </w:r>
+    </w:p>
+    <w:p>
+      <w:pPr>
+        <w:numPr>
+          <w:ilvl w:val="0"/>
+          <w:numId w:val="3"/>
+        </w:numPr>
+      </w:pPr>
+      <w:r>
+        <w:rPr>
+          <w:b/>
+          <w:bCs/>
+        </w:rPr>
+        <w:t>Cópias:</w:t>
+      </w:r>
+      <w:r>
+        <w:t xml:space="preserve"> criptografadas, guardadas fora do servidor do banco, com retenção de 30 dias.</w:t>
+      </w:r>
+    </w:p>
+    <w:p>
+      <w:pPr>
+        <w:numPr>
+          <w:ilvl w:val="0"/>
+          <w:numId w:val="3"/>
+        </w:numPr>
+      </w:pPr>
+      <w:r>
+        <w:rPr>
+          <w:b/>
+          <w:bCs/>
+        </w:rPr>
+        <w:lastRenderedPageBreak/>
+        <w:t>Teste:</w:t>
+      </w:r>
+      <w:r>
+        <w:t xml:space="preserve"> restauração em homologação todo mês, porque backup não testado não conta como backup.</w:t>
+      </w:r>
+    </w:p>
+    <w:p>
+      <w:pPr>
+        <w:numPr>
+          <w:ilvl w:val="0"/>
+          <w:numId w:val="3"/>
+        </w:numPr>
+      </w:pPr>
+      <w:r>
+        <w:rPr>
+          <w:b/>
+          <w:bCs/>
+        </w:rPr>
+        <w:t>Opcional:</w:t>
+      </w:r>
+      <w:r>
+        <w:t xml:space="preserve"> réplica de leitura para o RF09, que alivia a carga do banco principal.</w:t>
+      </w:r>
+    </w:p>
+    <w:p>
+      <w:pPr>
+        <w:rPr>
+          <w:b/>
+          <w:bCs/>
+        </w:rPr>
+      </w:pPr>
+    </w:p>
+    <w:p/>
+    <w:p>
+      <w:pPr>
+        <w:rPr>
+          <w:b/>
+          <w:bCs/>
+        </w:rPr>
+      </w:pPr>
+      <w:r>
+        <w:rPr>
+          <w:b/>
+          <w:bCs/>
+        </w:rPr>
+        <w:t>6.5.3.7 LGPD</w:t>
+      </w:r>
+    </w:p>
+    <w:p>
+      <w:pPr>
+        <w:numPr>
+          <w:ilvl w:val="0"/>
+          <w:numId w:val="4"/>
+        </w:numPr>
+      </w:pPr>
+      <w:r>
+        <w:rPr>
+          <w:b/>
+          <w:bCs/>
+        </w:rPr>
+        <w:t>Minimização: coletar somente os dados necessários às funcionalidades de cadastro de clientes e colaboradores (RF03, RF11 e RF17).</w:t>
+      </w:r>
+    </w:p>
+    <w:p>
+      <w:pPr>
+        <w:numPr>
+          <w:ilvl w:val="0"/>
+          <w:numId w:val="4"/>
+        </w:numPr>
+      </w:pPr>
+      <w:r>
+        <w:rPr>
+          <w:b/>
+          <w:bCs/>
+        </w:rPr>
+        <w:t>Finalidade:</w:t>
+      </w:r>
+      <w:r>
+        <w:t xml:space="preserve"> os dados pessoais são usados apenas para o atendimento e o acompanhamento de vendas da agência.</w:t>
+      </w:r>
+    </w:p>
+    <w:p>
+      <w:pPr>
+        <w:numPr>
+          <w:ilvl w:val="0"/>
+          <w:numId w:val="4"/>
+        </w:numPr>
+      </w:pPr>
+      <w:r>
+        <w:rPr>
+          <w:b/>
+          <w:bCs/>
+        </w:rPr>
+        <w:t>Direitos do titular:</w:t>
+      </w:r>
+      <w:r>
+        <w:t xml:space="preserve"> o banco permite anonimizar ou excluir um cliente a pedido. Como o DELETE é negado em produção, isso é feito por rotina administrativa controlada.</w:t>
+      </w:r>
+    </w:p>
+    <w:p>
+      <w:pPr>
+        <w:numPr>
+          <w:ilvl w:val="0"/>
+          <w:numId w:val="4"/>
+        </w:numPr>
+      </w:pPr>
+      <w:r>
+        <w:rPr>
+          <w:b/>
+          <w:bCs/>
+        </w:rPr>
+        <w:t>Retenção:</w:t>
+      </w:r>
+      <w:r>
+        <w:t xml:space="preserve"> definir prazo para dados de clientes inativos.</w:t>
+      </w:r>
+    </w:p>
+    <w:p>
+      <w:pPr>
+        <w:numPr>
+          <w:ilvl w:val="0"/>
+          <w:numId w:val="4"/>
+        </w:numPr>
+      </w:pPr>
+      <w:r>
+        <w:rPr>
+          <w:b/>
+          <w:bCs/>
+        </w:rPr>
+        <w:t>Terceiros: as integrações com a API de pagamento (RF05) e o serviço de e-mail (RF06) podem transmitir dados pessoais; enviar somente os dados estritamente necessários. Se novos serviços externos forem integrados, esta seção deverá ser revisada.</w:t>
+      </w:r>
+    </w:p>
+    <w:p/>
+    <w:p>
+      <w:pPr>
+        <w:rPr>
+          <w:b/>
+          <w:bCs/>
+        </w:rPr>
+      </w:pPr>
+      <w:r>
+        <w:rPr>
+          <w:b/>
+          <w:bCs/>
+        </w:rPr>
+        <w:t>6.5.3.8 Ambientes e mudanças</w:t>
+      </w:r>
+    </w:p>
+    <w:p>
+      <w:pPr>
+        <w:numPr>
+          <w:ilvl w:val="0"/>
+          <w:numId w:val="5"/>
+        </w:numPr>
+      </w:pPr>
+      <w:r>
+        <w:t xml:space="preserve">Ambientes separados de desenvolvimento, homologação e produção. Desenvolvimento usa </w:t>
+      </w:r>
+      <w:r>
+        <w:rPr>
+          <w:b/>
+          <w:bCs/>
+        </w:rPr>
+        <w:t>dados fictícios</w:t>
+      </w:r>
+      <w:r>
+        <w:t>, nunca cópia de produção.</w:t>
+      </w:r>
+    </w:p>
+    <w:p>
+      <w:pPr>
+        <w:numPr>
+          <w:ilvl w:val="0"/>
+          <w:numId w:val="5"/>
+        </w:numPr>
+      </w:pPr>
+      <w:r>
+        <w:t xml:space="preserve">Alterações de esquema só por </w:t>
+      </w:r>
+      <w:proofErr w:type="spellStart"/>
+      <w:r>
+        <w:rPr>
+          <w:i/>
+          <w:iCs/>
+        </w:rPr>
+        <w:t>migrations</w:t>
+      </w:r>
+      <w:proofErr w:type="spellEnd"/>
+      <w:r>
+        <w:t xml:space="preserve"> </w:t>
+      </w:r>
+      <w:proofErr w:type="spellStart"/>
+      <w:r>
+        <w:t>versionadas</w:t>
+      </w:r>
+      <w:proofErr w:type="spellEnd"/>
+      <w:r>
+        <w:t xml:space="preserve">, executadas pela conta </w:t>
+      </w:r>
+      <w:proofErr w:type="spellStart"/>
+      <w:r>
+        <w:t>dono_schema</w:t>
+      </w:r>
+      <w:proofErr w:type="spellEnd"/>
+      <w:r>
+        <w:t>.</w:t>
+      </w:r>
+    </w:p>
+    <w:p>
+      <w:pPr>
+        <w:numPr>
+          <w:ilvl w:val="0"/>
+          <w:numId w:val="5"/>
+        </w:numPr>
+      </w:pPr>
+      <w:r>
+        <w:t>Atualizações de segurança do SGBD aplicadas na janela de manutenção.</w:t>
+      </w:r>
+    </w:p>
+    <w:p/>
+    <w:p>
+      <w:pPr>
+        <w:rPr>
+          <w:b/>
+          <w:bCs/>
+        </w:rPr>
+      </w:pPr>
+      <w:r>
+        <w:rPr>
+          <w:b/>
+          <w:bCs/>
+        </w:rPr>
+        <w:t>6.5.4 Verificação</w:t>
+      </w:r>
+    </w:p>
+    <w:p>
+      <w:pPr>
+        <w:numPr>
+          <w:ilvl w:val="0"/>
+          <w:numId w:val="6"/>
+        </w:numPr>
+      </w:pPr>
+      <w:r>
+        <w:rPr>
+          <w:b/>
+          <w:bCs/>
+        </w:rPr>
+        <w:t>Privilégios:</w:t>
+      </w:r>
+      <w:r>
+        <w:t xml:space="preserve"> conectar como </w:t>
+      </w:r>
+      <w:proofErr w:type="spellStart"/>
+      <w:r>
+        <w:t>app_atendente</w:t>
+      </w:r>
+      <w:proofErr w:type="spellEnd"/>
+      <w:r>
+        <w:t xml:space="preserve"> e tentar SELECT em vendas. Deve falhar.</w:t>
+      </w:r>
+    </w:p>
+    <w:p>
+      <w:pPr>
+        <w:numPr>
+          <w:ilvl w:val="0"/>
+          <w:numId w:val="6"/>
+        </w:numPr>
+      </w:pPr>
+      <w:r>
+        <w:rPr>
+          <w:b/>
+          <w:bCs/>
+        </w:rPr>
+        <w:lastRenderedPageBreak/>
+        <w:t xml:space="preserve">Duplicidade: inserir dois usuários com o mesmo CPF (RF11). O banco </w:t>
+      </w:r>
+      <w:r>
+        <w:rPr>
+          <w:b/>
+          <w:bCs/>
+        </w:rPr>
+        <w:t>deve rejeitar o segundo.</w:t>
+      </w:r>
+    </w:p>
+    <w:p>
+      <w:pPr>
+        <w:numPr>
+          <w:ilvl w:val="0"/>
+          <w:numId w:val="6"/>
+        </w:numPr>
+      </w:pPr>
+      <w:proofErr w:type="spellStart"/>
+      <w:r>
+        <w:rPr>
+          <w:b/>
+          <w:bCs/>
+        </w:rPr>
+        <w:t>Rollback</w:t>
+      </w:r>
+      <w:proofErr w:type="spellEnd"/>
+      <w:r>
+        <w:rPr>
+          <w:b/>
+          <w:bCs/>
+        </w:rPr>
+        <w:t>: interromper a conexão durante uma atualização de cliente (RF17) e confirmar que o registro permanece íntegro.</w:t>
+      </w:r>
+    </w:p>
+    <w:p>
+      <w:pPr>
+        <w:numPr>
+          <w:ilvl w:val="0"/>
+          <w:numId w:val="6"/>
+        </w:numPr>
+      </w:pPr>
+      <w:r>
+        <w:rPr>
+          <w:b/>
+          <w:bCs/>
+        </w:rPr>
+        <w:t>Bloqueio: cinco logins incorretos devem definir o status do usuário como bloqueada (RF12).</w:t>
+      </w:r>
+    </w:p>
+    <w:p>
+      <w:pPr>
+        <w:numPr>
+          <w:ilvl w:val="0"/>
+          <w:numId w:val="6"/>
+        </w:numPr>
+      </w:pPr>
+      <w:r>
+        <w:rPr>
+          <w:b/>
+          <w:bCs/>
+        </w:rPr>
+        <w:t>Restauração:</w:t>
+      </w:r>
+      <w:r>
+        <w:t xml:space="preserve"> restaurar o backup e comparar contagens de registros.</w:t>
+      </w:r>
+    </w:p>
+    <w:p>
+      <w:pPr>
+        <w:numPr>
+          <w:ilvl w:val="0"/>
+          <w:numId w:val="6"/>
+        </w:numPr>
+      </w:pPr>
+      <w:r>
+        <w:rPr>
+          <w:b/>
+          <w:bCs/>
+        </w:rPr>
+        <w:t>Auditoria:</w:t>
+      </w:r>
+      <w:r>
+        <w:t xml:space="preserve"> alterar um cliente e confirmar o registro na tabela auditoria.</w:t>
+      </w:r>
+    </w:p>
+    <w:p/>
+    <w:p>
       <w:pPr>
         <w:pStyle w:val="Ttulo2"/>
       </w:pPr>
-      <w:bookmarkStart w:id="21" w:name="_Toc242971822"/>
-      <w:r>
-        <w:t>6.5 Plano de Testes</w:t>
+      <w:bookmarkStart w:id="21" w:name="_Toc242973005"/>
+      <w:r>
+        <w:t>6.6 Plano de Testes</w:t>
       </w:r>
       <w:bookmarkEnd w:id="21"/>
     </w:p>
@@ -17434,7 +19702,6 @@
           <w:iCs/>
           <w:szCs w:val="24"/>
         </w:rPr>
-        <w:lastRenderedPageBreak/>
         <w:t>Resultado esperado:</w:t>
       </w:r>
       <w:r>
@@ -17504,6 +19771,7 @@
           <w:iCs/>
           <w:szCs w:val="24"/>
         </w:rPr>
+        <w:lastRenderedPageBreak/>
         <w:t>Resultado esperado:</w:t>
       </w:r>
       <w:r>
@@ -17819,7 +20087,6 @@
           <w:iCs/>
           <w:szCs w:val="24"/>
         </w:rPr>
-        <w:lastRenderedPageBreak/>
         <w:t>Como fazer:</w:t>
       </w:r>
       <w:r>
@@ -17889,6 +20156,7 @@
           <w:iCs/>
           <w:szCs w:val="24"/>
         </w:rPr>
+        <w:lastRenderedPageBreak/>
         <w:t>Como fazer:</w:t>
       </w:r>
       <w:r>
@@ -18191,7 +20459,6 @@
         <w:rPr>
           <w:szCs w:val="24"/>
         </w:rPr>
-        <w:lastRenderedPageBreak/>
         <w:t>Garantir que a Oceanun receba o dinheiro de forma segura e dê a baixa automática no pedido. Vamos testar os meios de pagamento atuais (Pix, Cartão de Crédito e Boleto).</w:t>
       </w:r>
     </w:p>
@@ -18255,6 +20522,7 @@
           <w:iCs/>
           <w:szCs w:val="24"/>
         </w:rPr>
+        <w:lastRenderedPageBreak/>
         <w:t>Resultado esperado:</w:t>
       </w:r>
       <w:r>
@@ -18576,7 +20844,6 @@
           <w:bCs/>
           <w:szCs w:val="24"/>
         </w:rPr>
-        <w:lastRenderedPageBreak/>
         <w:t>4. Critérios de Sucesso (Quando o sistema está pronto para ir ao ar?)</w:t>
       </w:r>
     </w:p>
@@ -18635,6 +20902,7 @@
           <w:bCs/>
           <w:szCs w:val="24"/>
         </w:rPr>
+        <w:lastRenderedPageBreak/>
         <w:t>O tempo de resposta foi bom:</w:t>
       </w:r>
       <w:r>
@@ -18680,7 +20948,7 @@
       <w:pPr>
         <w:pStyle w:val="Ttulo1"/>
       </w:pPr>
-      <w:bookmarkStart w:id="22" w:name="_Toc242971823"/>
+      <w:bookmarkStart w:id="22" w:name="_Toc242973006"/>
       <w:r>
         <w:t>7. Metodologia e Gestão do Projeto</w:t>
       </w:r>
@@ -18690,7 +20958,7 @@
       <w:pPr>
         <w:pStyle w:val="Ttulo2"/>
       </w:pPr>
-      <w:bookmarkStart w:id="23" w:name="_Toc242971824"/>
+      <w:bookmarkStart w:id="23" w:name="_Toc242973007"/>
       <w:r>
         <w:t>7.1 Gestão de Configuração de Software</w:t>
       </w:r>
@@ -18763,7 +21031,7 @@
       <w:pPr>
         <w:pStyle w:val="Ttulo2"/>
       </w:pPr>
-      <w:bookmarkStart w:id="24" w:name="_Toc242971825"/>
+      <w:bookmarkStart w:id="24" w:name="_Toc242973008"/>
       <w:r>
         <w:lastRenderedPageBreak/>
         <w:t>7.2 Métricas</w:t>
@@ -18775,7 +21043,7 @@
         <w:pStyle w:val="Ttulo2"/>
       </w:pPr>
       <w:bookmarkStart w:id="25" w:name="_31n4nugo8an5"/>
-      <w:bookmarkStart w:id="26" w:name="_Toc242971826"/>
+      <w:bookmarkStart w:id="26" w:name="_Toc242973009"/>
       <w:bookmarkEnd w:id="25"/>
       <w:r>
         <w:t>Cálculo do número de pontos de função estimado para o sistema</w:t>
@@ -20385,7 +22653,7 @@
         </w:rPr>
       </w:pPr>
       <w:bookmarkStart w:id="27" w:name="_lv1nz11p0iv3"/>
-      <w:bookmarkStart w:id="28" w:name="_Toc242971827"/>
+      <w:bookmarkStart w:id="28" w:name="_Toc242973010"/>
       <w:bookmarkEnd w:id="27"/>
       <w:r>
         <w:lastRenderedPageBreak/>
@@ -20403,7 +22671,7 @@
         </w:rPr>
       </w:pPr>
       <w:bookmarkStart w:id="29" w:name="_sd8tswopm25d"/>
-      <w:bookmarkStart w:id="30" w:name="_Toc242971828"/>
+      <w:bookmarkStart w:id="30" w:name="_Toc242973011"/>
       <w:bookmarkEnd w:id="29"/>
       <w:r>
         <w:rPr>
@@ -20525,7 +22793,7 @@
           <w:noProof/>
         </w:rPr>
         <w:drawing>
-          <wp:inline distT="0" distB="0" distL="0" distR="0" wp14:anchorId="7F601D03" wp14:editId="25460A88">
+          <wp:inline distT="0" distB="0" distL="0" distR="0" wp14:anchorId="09AC02EF" wp14:editId="26F93B74">
             <wp:extent cx="1838325" cy="914400"/>
             <wp:effectExtent l="0" t="0" r="0" b="0"/>
             <wp:docPr id="8" name="image1.png"/>
@@ -20612,7 +22880,7 @@
           <w:noProof/>
         </w:rPr>
         <w:drawing>
-          <wp:inline distT="0" distB="0" distL="0" distR="0" wp14:anchorId="0B0EC26D" wp14:editId="504579DB">
+          <wp:inline distT="0" distB="0" distL="0" distR="0" wp14:anchorId="426AA68F" wp14:editId="1084987D">
             <wp:extent cx="4610100" cy="923925"/>
             <wp:effectExtent l="0" t="0" r="0" b="0"/>
             <wp:docPr id="9" name="image7.png"/>
@@ -20668,7 +22936,7 @@
         </w:rPr>
       </w:pPr>
       <w:bookmarkStart w:id="31" w:name="_pubx2lgeh9u4"/>
-      <w:bookmarkStart w:id="32" w:name="_Toc242971829"/>
+      <w:bookmarkStart w:id="32" w:name="_Toc242973012"/>
       <w:bookmarkEnd w:id="31"/>
       <w:r>
         <w:rPr>
@@ -20722,7 +22990,7 @@
           <w:noProof/>
         </w:rPr>
         <w:drawing>
-          <wp:inline distT="0" distB="0" distL="0" distR="0" wp14:anchorId="1460B17C" wp14:editId="5C859D3D">
+          <wp:inline distT="0" distB="0" distL="0" distR="0" wp14:anchorId="49DAB366" wp14:editId="66212E8A">
             <wp:extent cx="5648325" cy="902970"/>
             <wp:effectExtent l="0" t="0" r="0" b="0"/>
             <wp:docPr id="10" name="image4.png"/>
@@ -20815,7 +23083,7 @@
         </w:rPr>
       </w:pPr>
       <w:bookmarkStart w:id="33" w:name="_jtp4ine70pmh"/>
-      <w:bookmarkStart w:id="34" w:name="_Toc242971830"/>
+      <w:bookmarkStart w:id="34" w:name="_Toc242973013"/>
       <w:bookmarkEnd w:id="33"/>
       <w:r>
         <w:rPr>
@@ -20921,7 +23189,7 @@
           <w:noProof/>
         </w:rPr>
         <w:drawing>
-          <wp:inline distT="0" distB="0" distL="0" distR="0" wp14:anchorId="0CEE1A09" wp14:editId="25697BD3">
+          <wp:inline distT="0" distB="0" distL="0" distR="0" wp14:anchorId="22033FD9" wp14:editId="71B527E5">
             <wp:extent cx="4714875" cy="895350"/>
             <wp:effectExtent l="0" t="0" r="0" b="0"/>
             <wp:docPr id="11" name="image6.png"/>
@@ -21007,7 +23275,7 @@
       <w:pPr>
         <w:pStyle w:val="Ttulo2"/>
       </w:pPr>
-      <w:bookmarkStart w:id="35" w:name="_Toc242971831"/>
+      <w:bookmarkStart w:id="35" w:name="_Toc242973014"/>
       <w:r>
         <w:t>7.3 SCRUM e planejamento de sprints</w:t>
       </w:r>
@@ -21018,7 +23286,7 @@
         <w:pStyle w:val="Ttulo2"/>
       </w:pPr>
       <w:bookmarkStart w:id="36" w:name="_g1sfz922ae55"/>
-      <w:bookmarkStart w:id="37" w:name="_Toc242971832"/>
+      <w:bookmarkStart w:id="37" w:name="_Toc242973015"/>
       <w:bookmarkEnd w:id="36"/>
       <w:r>
         <w:t>Definição do backlog do sistema</w:t>
@@ -21261,7 +23529,7 @@
         <w:pStyle w:val="Ttulo2"/>
       </w:pPr>
       <w:bookmarkStart w:id="38" w:name="_kfyfsd24wa0k"/>
-      <w:bookmarkStart w:id="39" w:name="_Toc242971833"/>
+      <w:bookmarkStart w:id="39" w:name="_Toc242973016"/>
       <w:bookmarkEnd w:id="38"/>
       <w:r>
         <w:t>Definição da primeira sprint</w:t>
@@ -21405,7 +23673,7 @@
         <w:pStyle w:val="Ttulo2"/>
       </w:pPr>
       <w:bookmarkStart w:id="41" w:name="_4h0w1vjemwxw"/>
-      <w:bookmarkStart w:id="42" w:name="_Toc242971834"/>
+      <w:bookmarkStart w:id="42" w:name="_Toc242973017"/>
       <w:bookmarkEnd w:id="41"/>
       <w:r>
         <w:lastRenderedPageBreak/>
@@ -21422,7 +23690,7 @@
           <w:noProof/>
         </w:rPr>
         <w:drawing>
-          <wp:inline distT="0" distB="0" distL="0" distR="0" wp14:anchorId="5AC01C1A" wp14:editId="1702F21B">
+          <wp:inline distT="0" distB="0" distL="0" distR="0" wp14:anchorId="4DC861A5" wp14:editId="1B56CEAF">
             <wp:extent cx="5731510" cy="2819400"/>
             <wp:effectExtent l="0" t="0" r="0" b="0"/>
             <wp:docPr id="12" name="image3.png"/>
@@ -21470,7 +23738,7 @@
         <w:pStyle w:val="Ttulo2"/>
       </w:pPr>
       <w:bookmarkStart w:id="43" w:name="_9djs283v7y3o"/>
-      <w:bookmarkStart w:id="44" w:name="_Toc242971835"/>
+      <w:bookmarkStart w:id="44" w:name="_Toc242973018"/>
       <w:bookmarkEnd w:id="43"/>
       <w:proofErr w:type="spellStart"/>
       <w:r>
@@ -21499,7 +23767,7 @@
           <w:noProof/>
         </w:rPr>
         <w:drawing>
-          <wp:inline distT="0" distB="0" distL="0" distR="0" wp14:anchorId="670EB56C" wp14:editId="3A52D23E">
+          <wp:inline distT="0" distB="0" distL="0" distR="0" wp14:anchorId="6C43DDF2" wp14:editId="02A68CF8">
             <wp:extent cx="3441065" cy="3617595"/>
             <wp:effectExtent l="0" t="0" r="0" b="0"/>
             <wp:docPr id="13" name="image2.png"/>
@@ -21541,7 +23809,7 @@
       <w:pPr>
         <w:pStyle w:val="Ttulo1"/>
       </w:pPr>
-      <w:bookmarkStart w:id="45" w:name="_Toc242971836"/>
+      <w:bookmarkStart w:id="45" w:name="_Toc242973019"/>
       <w:r>
         <w:t>8. Evidências de Execução da Extensão</w:t>
       </w:r>
@@ -21652,8 +23920,11 @@
         </w:rPr>
       </w:pPr>
       <w:r>
+        <w:rPr>
+          <w:noProof/>
+        </w:rPr>
         <w:drawing>
-          <wp:inline distT="0" distB="0" distL="0" distR="0" wp14:anchorId="66427E67" wp14:editId="4F1BA8FB">
+          <wp:inline distT="0" distB="0" distL="0" distR="0" wp14:anchorId="4A7AC9E7" wp14:editId="58A58BC9">
             <wp:extent cx="5105400" cy="3819525"/>
             <wp:effectExtent l="0" t="0" r="0" b="0"/>
             <wp:docPr id="16" name="Imagem 16"/>
@@ -22279,7 +24550,7 @@
       <w:pPr>
         <w:pStyle w:val="Ttulo1"/>
       </w:pPr>
-      <w:bookmarkStart w:id="46" w:name="_Toc242971837"/>
+      <w:bookmarkStart w:id="46" w:name="_Toc242973020"/>
       <w:r>
         <w:t>9. Próximos Passos</w:t>
       </w:r>
@@ -22295,7 +24566,7 @@
       <w:pPr>
         <w:pStyle w:val="Ttulo1"/>
       </w:pPr>
-      <w:bookmarkStart w:id="47" w:name="_Toc242971838"/>
+      <w:bookmarkStart w:id="47" w:name="_Toc242973021"/>
       <w:r>
         <w:lastRenderedPageBreak/>
         <w:t>10. Anexos e Referências</w:t>
@@ -28933,63 +31204,18 @@
   </w:num>
   <w:num w:numId="40" w16cid:durableId="228393834">
     <w:abstractNumId w:val="17"/>
-    <w:lvlOverride w:ilvl="0"/>
-    <w:lvlOverride w:ilvl="1"/>
-    <w:lvlOverride w:ilvl="2"/>
-    <w:lvlOverride w:ilvl="3"/>
-    <w:lvlOverride w:ilvl="4"/>
-    <w:lvlOverride w:ilvl="5"/>
-    <w:lvlOverride w:ilvl="6"/>
-    <w:lvlOverride w:ilvl="7"/>
-    <w:lvlOverride w:ilvl="8"/>
   </w:num>
   <w:num w:numId="41" w16cid:durableId="577639734">
     <w:abstractNumId w:val="15"/>
-    <w:lvlOverride w:ilvl="0"/>
-    <w:lvlOverride w:ilvl="1"/>
-    <w:lvlOverride w:ilvl="2"/>
-    <w:lvlOverride w:ilvl="3"/>
-    <w:lvlOverride w:ilvl="4"/>
-    <w:lvlOverride w:ilvl="5"/>
-    <w:lvlOverride w:ilvl="6"/>
-    <w:lvlOverride w:ilvl="7"/>
-    <w:lvlOverride w:ilvl="8"/>
   </w:num>
   <w:num w:numId="42" w16cid:durableId="1992295979">
     <w:abstractNumId w:val="43"/>
-    <w:lvlOverride w:ilvl="0"/>
-    <w:lvlOverride w:ilvl="1"/>
-    <w:lvlOverride w:ilvl="2"/>
-    <w:lvlOverride w:ilvl="3"/>
-    <w:lvlOverride w:ilvl="4"/>
-    <w:lvlOverride w:ilvl="5"/>
-    <w:lvlOverride w:ilvl="6"/>
-    <w:lvlOverride w:ilvl="7"/>
-    <w:lvlOverride w:ilvl="8"/>
   </w:num>
   <w:num w:numId="43" w16cid:durableId="1600673944">
     <w:abstractNumId w:val="23"/>
-    <w:lvlOverride w:ilvl="0"/>
-    <w:lvlOverride w:ilvl="1"/>
-    <w:lvlOverride w:ilvl="2"/>
-    <w:lvlOverride w:ilvl="3"/>
-    <w:lvlOverride w:ilvl="4"/>
-    <w:lvlOverride w:ilvl="5"/>
-    <w:lvlOverride w:ilvl="6"/>
-    <w:lvlOverride w:ilvl="7"/>
-    <w:lvlOverride w:ilvl="8"/>
   </w:num>
   <w:num w:numId="44" w16cid:durableId="2010205782">
     <w:abstractNumId w:val="12"/>
-    <w:lvlOverride w:ilvl="0"/>
-    <w:lvlOverride w:ilvl="1"/>
-    <w:lvlOverride w:ilvl="2"/>
-    <w:lvlOverride w:ilvl="3"/>
-    <w:lvlOverride w:ilvl="4"/>
-    <w:lvlOverride w:ilvl="5"/>
-    <w:lvlOverride w:ilvl="6"/>
-    <w:lvlOverride w:ilvl="7"/>
-    <w:lvlOverride w:ilvl="8"/>
   </w:num>
 </w:numbering>
 </file>
@@ -29520,6 +31746,7 @@
   <w:style w:type="character" w:default="1" w:styleId="Fontepargpadro">
     <w:name w:val="Default Paragraph Font"/>
     <w:uiPriority w:val="1"/>
+    <w:semiHidden/>
     <w:unhideWhenUsed/>
   </w:style>
   <w:style w:type="table" w:default="1" w:styleId="Tabelanormal">

</xml_diff>